<commit_message>
update bakresume finish v1
</commit_message>
<xml_diff>
--- a/src/main/resources/于飞-简历-Java-5年 - 副本.docx
+++ b/src/main/resources/于飞-简历-Java-5年 - 副本.docx
@@ -968,6 +968,14 @@
       </w:pPr>
       <w:r>
         <w:rPr>
+          <w:rFonts w:ascii="Calibri" w:eastAsia="华文细黑" w:hAnsi="Calibri" w:cs="Calibri" w:hint="eastAsia"/>
+          <w:color w:val="404040" w:themeColor="text1" w:themeTint="BF"/>
+          <w:szCs w:val="21"/>
+        </w:rPr>
+        <w:t>精通</w:t>
+      </w:r>
+      <w:r>
+        <w:rPr>
           <w:rFonts w:eastAsia="微软雅黑"/>
           <w:b/>
           <w:bCs/>
@@ -1143,30 +1151,6 @@
           <w:color w:val="404040" w:themeColor="text1" w:themeTint="BF"/>
           <w:szCs w:val="21"/>
         </w:rPr>
-        <w:t>基础扎实</w:t>
-      </w:r>
-      <w:r>
-        <w:rPr>
-          <w:rFonts w:ascii="Calibri" w:eastAsia="华文细黑" w:hAnsi="Calibri" w:cs="Calibri"/>
-          <w:color w:val="404040" w:themeColor="text1" w:themeTint="BF"/>
-          <w:szCs w:val="21"/>
-        </w:rPr>
-        <w:t>，熟悉</w:t>
-      </w:r>
-      <w:r>
-        <w:rPr>
-          <w:rFonts w:ascii="Calibri" w:eastAsia="华文细黑" w:hAnsi="Calibri" w:cs="Calibri"/>
-          <w:color w:val="404040" w:themeColor="text1" w:themeTint="BF"/>
-          <w:szCs w:val="21"/>
-        </w:rPr>
-        <w:t>多线程、并发开发</w:t>
-      </w:r>
-      <w:r>
-        <w:rPr>
-          <w:rFonts w:ascii="Calibri" w:eastAsia="华文细黑" w:hAnsi="Calibri" w:cs="Calibri"/>
-          <w:color w:val="404040" w:themeColor="text1" w:themeTint="BF"/>
-          <w:szCs w:val="21"/>
-        </w:rPr>
         <w:t>，</w:t>
       </w:r>
       <w:r>
@@ -1175,15 +1159,23 @@
           <w:color w:val="404040" w:themeColor="text1" w:themeTint="BF"/>
           <w:szCs w:val="21"/>
         </w:rPr>
-        <w:t>了解常用设计模式和算法，</w:t>
-      </w:r>
-      <w:r>
-        <w:rPr>
-          <w:rFonts w:ascii="Calibri" w:eastAsia="华文细黑" w:hAnsi="Calibri" w:cs="Calibri"/>
-          <w:color w:val="404040" w:themeColor="text1" w:themeTint="BF"/>
-          <w:szCs w:val="21"/>
-        </w:rPr>
-        <w:t>熟悉</w:t>
+        <w:t>深入理解</w:t>
+      </w:r>
+      <w:r>
+        <w:rPr>
+          <w:rFonts w:ascii="Calibri" w:eastAsia="华文细黑" w:hAnsi="Calibri" w:cs="Calibri"/>
+          <w:color w:val="404040" w:themeColor="text1" w:themeTint="BF"/>
+          <w:szCs w:val="21"/>
+        </w:rPr>
+        <w:t>多线程、并发</w:t>
+      </w:r>
+      <w:r>
+        <w:rPr>
+          <w:rFonts w:ascii="Calibri" w:eastAsia="华文细黑" w:hAnsi="Calibri" w:cs="Calibri" w:hint="eastAsia"/>
+          <w:color w:val="404040" w:themeColor="text1" w:themeTint="BF"/>
+          <w:szCs w:val="21"/>
+        </w:rPr>
+        <w:t>编程、</w:t>
       </w:r>
       <w:r>
         <w:rPr>
@@ -1200,6 +1192,22 @@
           <w:szCs w:val="21"/>
         </w:rPr>
         <w:t>原理</w:t>
+      </w:r>
+      <w:r>
+        <w:rPr>
+          <w:rFonts w:ascii="Calibri" w:eastAsia="华文细黑" w:hAnsi="Calibri" w:cs="Calibri" w:hint="eastAsia"/>
+          <w:color w:val="404040" w:themeColor="text1" w:themeTint="BF"/>
+          <w:szCs w:val="21"/>
+        </w:rPr>
+        <w:t>及性能优化</w:t>
+      </w:r>
+      <w:r>
+        <w:rPr>
+          <w:rFonts w:ascii="Calibri" w:eastAsia="华文细黑" w:hAnsi="Calibri" w:cs="Calibri" w:hint="eastAsia"/>
+          <w:color w:val="404040" w:themeColor="text1" w:themeTint="BF"/>
+          <w:szCs w:val="21"/>
+        </w:rPr>
+        <w:t>，熟练运用设计模式</w:t>
       </w:r>
     </w:p>
     <w:p>
@@ -1227,51 +1235,51 @@
       </w:r>
       <w:r>
         <w:rPr>
-          <w:rFonts w:ascii="Calibri" w:eastAsia="华文细黑" w:hAnsi="Calibri" w:cs="Calibri" w:hint="eastAsia"/>
-          <w:color w:val="404040" w:themeColor="text1" w:themeTint="BF"/>
-          <w:szCs w:val="21"/>
-        </w:rPr>
-        <w:t>原理、</w:t>
-      </w:r>
-      <w:r>
-        <w:rPr>
-          <w:rFonts w:ascii="Calibri" w:eastAsia="华文细黑" w:hAnsi="Calibri" w:cs="Calibri"/>
-          <w:color w:val="404040" w:themeColor="text1" w:themeTint="BF"/>
-          <w:szCs w:val="21"/>
-        </w:rPr>
-        <w:t>设计和应用，对分布式常用技术</w:t>
-      </w:r>
-      <w:r>
-        <w:rPr>
-          <w:rFonts w:ascii="Calibri" w:eastAsia="华文细黑" w:hAnsi="Calibri" w:cs="Calibri"/>
-          <w:color w:val="404040" w:themeColor="text1" w:themeTint="BF"/>
-          <w:szCs w:val="21"/>
-        </w:rPr>
-        <w:t>能</w:t>
-      </w:r>
-      <w:r>
-        <w:rPr>
-          <w:rFonts w:ascii="Calibri" w:eastAsia="华文细黑" w:hAnsi="Calibri" w:cs="Calibri"/>
-          <w:color w:val="404040" w:themeColor="text1" w:themeTint="BF"/>
-          <w:szCs w:val="21"/>
-        </w:rPr>
-        <w:t>根据业务场景</w:t>
-      </w:r>
-      <w:r>
-        <w:rPr>
-          <w:rFonts w:ascii="Calibri" w:eastAsia="华文细黑" w:hAnsi="Calibri" w:cs="Calibri" w:hint="eastAsia"/>
-          <w:color w:val="404040" w:themeColor="text1" w:themeTint="BF"/>
-          <w:szCs w:val="21"/>
-        </w:rPr>
-        <w:t>合理</w:t>
-      </w:r>
-      <w:r>
-        <w:rPr>
-          <w:rFonts w:ascii="Calibri" w:eastAsia="华文细黑" w:hAnsi="Calibri" w:cs="Calibri" w:hint="eastAsia"/>
-          <w:color w:val="404040" w:themeColor="text1" w:themeTint="BF"/>
-          <w:szCs w:val="21"/>
-        </w:rPr>
-        <w:t>选择</w:t>
+          <w:rFonts w:ascii="Calibri" w:eastAsia="华文细黑" w:hAnsi="Calibri" w:cs="Calibri"/>
+          <w:color w:val="404040" w:themeColor="text1" w:themeTint="BF"/>
+          <w:szCs w:val="21"/>
+        </w:rPr>
+        <w:t>设计</w:t>
+      </w:r>
+      <w:r>
+        <w:rPr>
+          <w:rFonts w:ascii="Calibri" w:eastAsia="华文细黑" w:hAnsi="Calibri" w:cs="Calibri"/>
+          <w:color w:val="404040" w:themeColor="text1" w:themeTint="BF"/>
+          <w:szCs w:val="21"/>
+        </w:rPr>
+        <w:t>，</w:t>
+      </w:r>
+      <w:r>
+        <w:rPr>
+          <w:rFonts w:ascii="Calibri" w:eastAsia="华文细黑" w:hAnsi="Calibri" w:cs="Calibri"/>
+          <w:color w:val="404040" w:themeColor="text1" w:themeTint="BF"/>
+          <w:szCs w:val="21"/>
+        </w:rPr>
+        <w:t>具备高并发</w:t>
+      </w:r>
+      <w:r>
+        <w:rPr>
+          <w:rFonts w:ascii="Calibri" w:eastAsia="华文细黑" w:hAnsi="Calibri" w:cs="Calibri" w:hint="eastAsia"/>
+          <w:color w:val="404040" w:themeColor="text1" w:themeTint="BF"/>
+          <w:szCs w:val="21"/>
+        </w:rPr>
+        <w:t>、高可靠、高性能</w:t>
+      </w:r>
+      <w:r>
+        <w:rPr>
+          <w:rFonts w:ascii="Calibri" w:eastAsia="华文细黑" w:hAnsi="Calibri" w:cs="Calibri"/>
+          <w:color w:val="404040" w:themeColor="text1" w:themeTint="BF"/>
+          <w:szCs w:val="21"/>
+        </w:rPr>
+        <w:t>系统设计经验</w:t>
+      </w:r>
+      <w:r>
+        <w:rPr>
+          <w:rFonts w:ascii="Calibri" w:eastAsia="华文细黑" w:hAnsi="Calibri" w:cs="Calibri" w:hint="eastAsia"/>
+          <w:color w:val="404040" w:themeColor="text1" w:themeTint="BF"/>
+          <w:szCs w:val="21"/>
+        </w:rPr>
+        <w:t>，</w:t>
       </w:r>
     </w:p>
     <w:p>
@@ -1295,55 +1303,63 @@
           <w:color w:val="404040" w:themeColor="text1" w:themeTint="BF"/>
           <w:szCs w:val="21"/>
         </w:rPr>
-        <w:t>熟悉常用分布式组件，有大数据</w:t>
-      </w:r>
-      <w:r>
-        <w:rPr>
-          <w:rFonts w:ascii="Calibri" w:eastAsia="华文细黑" w:hAnsi="Calibri" w:cs="Calibri" w:hint="eastAsia"/>
-          <w:color w:val="404040" w:themeColor="text1" w:themeTint="BF"/>
-          <w:szCs w:val="21"/>
-        </w:rPr>
-        <w:t>Hive</w:t>
-      </w:r>
-      <w:r>
-        <w:rPr>
-          <w:rFonts w:ascii="Calibri" w:eastAsia="华文细黑" w:hAnsi="Calibri" w:cs="Calibri" w:hint="eastAsia"/>
-          <w:color w:val="404040" w:themeColor="text1" w:themeTint="BF"/>
-          <w:szCs w:val="21"/>
-        </w:rPr>
-        <w:t>、</w:t>
-      </w:r>
-      <w:r>
-        <w:rPr>
-          <w:rFonts w:ascii="Calibri" w:eastAsia="华文细黑" w:hAnsi="Calibri" w:cs="Calibri" w:hint="eastAsia"/>
-          <w:color w:val="404040" w:themeColor="text1" w:themeTint="BF"/>
-          <w:szCs w:val="21"/>
-        </w:rPr>
-        <w:t>Hadoop</w:t>
-      </w:r>
-      <w:r>
-        <w:rPr>
-          <w:rFonts w:ascii="Calibri" w:eastAsia="华文细黑" w:hAnsi="Calibri" w:cs="Calibri" w:hint="eastAsia"/>
-          <w:color w:val="404040" w:themeColor="text1" w:themeTint="BF"/>
-          <w:szCs w:val="21"/>
-        </w:rPr>
-        <w:t xml:space="preserve"> </w:t>
-      </w:r>
-      <w:r>
-        <w:rPr>
-          <w:rFonts w:ascii="Calibri" w:eastAsia="华文细黑" w:hAnsi="Calibri" w:cs="Calibri" w:hint="eastAsia"/>
-          <w:color w:val="404040" w:themeColor="text1" w:themeTint="BF"/>
-          <w:szCs w:val="21"/>
-        </w:rPr>
-        <w:t>MR</w:t>
-      </w:r>
-      <w:r>
-        <w:rPr>
-          <w:rFonts w:ascii="Calibri" w:eastAsia="华文细黑" w:hAnsi="Calibri" w:cs="Calibri" w:hint="eastAsia"/>
-          <w:color w:val="404040" w:themeColor="text1" w:themeTint="BF"/>
-          <w:szCs w:val="21"/>
-        </w:rPr>
-        <w:t>任务开发经验</w:t>
+        <w:t>熟悉常用分布式组件，</w:t>
+      </w:r>
+      <w:r>
+        <w:rPr>
+          <w:rFonts w:ascii="Calibri" w:eastAsia="华文细黑" w:hAnsi="Calibri" w:cs="Calibri" w:hint="eastAsia"/>
+          <w:color w:val="404040" w:themeColor="text1" w:themeTint="BF"/>
+          <w:szCs w:val="21"/>
+        </w:rPr>
+        <w:t>熟练使用</w:t>
+      </w:r>
+      <w:r>
+        <w:rPr>
+          <w:rFonts w:ascii="Calibri" w:eastAsia="华文细黑" w:hAnsi="Calibri" w:cs="Calibri" w:hint="eastAsia"/>
+          <w:color w:val="404040" w:themeColor="text1" w:themeTint="BF"/>
+          <w:szCs w:val="21"/>
+        </w:rPr>
+        <w:t>MySQL</w:t>
+      </w:r>
+      <w:r>
+        <w:rPr>
+          <w:rFonts w:ascii="Calibri" w:eastAsia="华文细黑" w:hAnsi="Calibri" w:cs="Calibri" w:hint="eastAsia"/>
+          <w:color w:val="404040" w:themeColor="text1" w:themeTint="BF"/>
+          <w:szCs w:val="21"/>
+        </w:rPr>
+        <w:t>等常用数据库</w:t>
+      </w:r>
+      <w:r>
+        <w:rPr>
+          <w:rFonts w:ascii="Calibri" w:eastAsia="华文细黑" w:hAnsi="Calibri" w:cs="Calibri" w:hint="eastAsia"/>
+          <w:color w:val="404040" w:themeColor="text1" w:themeTint="BF"/>
+          <w:szCs w:val="21"/>
+        </w:rPr>
+        <w:t>，</w:t>
+      </w:r>
+      <w:r>
+        <w:rPr>
+          <w:rFonts w:ascii="Calibri" w:eastAsia="华文细黑" w:hAnsi="Calibri" w:cs="Calibri" w:hint="eastAsia"/>
+          <w:color w:val="404040" w:themeColor="text1" w:themeTint="BF"/>
+          <w:szCs w:val="21"/>
+        </w:rPr>
+        <w:t>对</w:t>
+      </w:r>
+      <w:r>
+        <w:rPr>
+          <w:rFonts w:ascii="Calibri" w:eastAsia="华文细黑" w:hAnsi="Calibri" w:cs="Calibri" w:hint="eastAsia"/>
+          <w:color w:val="404040" w:themeColor="text1" w:themeTint="BF"/>
+          <w:szCs w:val="21"/>
+        </w:rPr>
+        <w:t>SQL</w:t>
+      </w:r>
+      <w:r>
+        <w:rPr>
+          <w:rFonts w:ascii="Calibri" w:eastAsia="华文细黑" w:hAnsi="Calibri" w:cs="Calibri" w:hint="eastAsia"/>
+          <w:color w:val="404040" w:themeColor="text1" w:themeTint="BF"/>
+          <w:szCs w:val="21"/>
+        </w:rPr>
+        <w:t>优化有实际的实践经验</w:t>
       </w:r>
     </w:p>
     <w:p>
@@ -1356,50 +1372,58 @@
         <w:spacing w:line="320" w:lineRule="exact"/>
         <w:ind w:left="357" w:firstLineChars="0" w:hanging="357"/>
         <w:rPr>
-          <w:rFonts w:ascii="Calibri" w:eastAsia="华文细黑" w:hAnsi="Calibri" w:cs="Calibri"/>
-          <w:color w:val="404040" w:themeColor="text1" w:themeTint="BF"/>
-          <w:szCs w:val="21"/>
-        </w:rPr>
-      </w:pPr>
-      <w:r>
-        <w:rPr>
-          <w:rFonts w:ascii="Calibri" w:eastAsia="华文细黑" w:hAnsi="Calibri" w:cs="Calibri" w:hint="eastAsia"/>
-          <w:color w:val="404040" w:themeColor="text1" w:themeTint="BF"/>
-          <w:szCs w:val="21"/>
-        </w:rPr>
-        <w:t>熟练使用</w:t>
-      </w:r>
-      <w:r>
-        <w:rPr>
-          <w:rFonts w:ascii="Calibri" w:eastAsia="华文细黑" w:hAnsi="Calibri" w:cs="Calibri" w:hint="eastAsia"/>
-          <w:color w:val="404040" w:themeColor="text1" w:themeTint="BF"/>
-          <w:szCs w:val="21"/>
-        </w:rPr>
-        <w:t>MySQL</w:t>
-      </w:r>
-      <w:r>
-        <w:rPr>
-          <w:rFonts w:ascii="Calibri" w:eastAsia="华文细黑" w:hAnsi="Calibri" w:cs="Calibri" w:hint="eastAsia"/>
-          <w:color w:val="404040" w:themeColor="text1" w:themeTint="BF"/>
-          <w:szCs w:val="21"/>
-        </w:rPr>
-        <w:t>等常用数据库，对</w:t>
-      </w:r>
-      <w:r>
-        <w:rPr>
-          <w:rFonts w:ascii="Calibri" w:eastAsia="华文细黑" w:hAnsi="Calibri" w:cs="Calibri" w:hint="eastAsia"/>
-          <w:color w:val="404040" w:themeColor="text1" w:themeTint="BF"/>
-          <w:szCs w:val="21"/>
-        </w:rPr>
-        <w:t>SQL</w:t>
-      </w:r>
-      <w:r>
-        <w:rPr>
-          <w:rFonts w:ascii="Calibri" w:eastAsia="华文细黑" w:hAnsi="Calibri" w:cs="Calibri" w:hint="eastAsia"/>
-          <w:color w:val="404040" w:themeColor="text1" w:themeTint="BF"/>
-          <w:szCs w:val="21"/>
-        </w:rPr>
-        <w:t>优化有实际的实践经验</w:t>
+          <w:rFonts w:ascii="Calibri" w:eastAsia="华文细黑" w:hAnsi="Calibri" w:cs="Calibri" w:hint="eastAsia"/>
+          <w:color w:val="404040" w:themeColor="text1" w:themeTint="BF"/>
+          <w:szCs w:val="21"/>
+        </w:rPr>
+      </w:pPr>
+      <w:r>
+        <w:rPr>
+          <w:rFonts w:ascii="Calibri" w:eastAsia="华文细黑" w:hAnsi="Calibri" w:cs="Calibri" w:hint="eastAsia"/>
+          <w:color w:val="404040" w:themeColor="text1" w:themeTint="BF"/>
+          <w:szCs w:val="21"/>
+        </w:rPr>
+        <w:t>熟悉</w:t>
+      </w:r>
+      <w:r>
+        <w:rPr>
+          <w:rFonts w:ascii="Calibri" w:eastAsia="华文细黑" w:hAnsi="Calibri" w:cs="Calibri" w:hint="eastAsia"/>
+          <w:color w:val="404040" w:themeColor="text1" w:themeTint="BF"/>
+          <w:szCs w:val="21"/>
+        </w:rPr>
+        <w:t>VUE</w:t>
+      </w:r>
+      <w:r>
+        <w:rPr>
+          <w:rFonts w:ascii="Calibri" w:eastAsia="华文细黑" w:hAnsi="Calibri" w:cs="Calibri" w:hint="eastAsia"/>
+          <w:color w:val="404040" w:themeColor="text1" w:themeTint="BF"/>
+          <w:szCs w:val="21"/>
+        </w:rPr>
+        <w:t>、</w:t>
+      </w:r>
+      <w:r>
+        <w:rPr>
+          <w:rFonts w:ascii="Calibri" w:eastAsia="华文细黑" w:hAnsi="Calibri" w:cs="Calibri" w:hint="eastAsia"/>
+          <w:color w:val="404040" w:themeColor="text1" w:themeTint="BF"/>
+          <w:szCs w:val="21"/>
+        </w:rPr>
+        <w:t>TS</w:t>
+      </w:r>
+      <w:r>
+        <w:rPr>
+          <w:rFonts w:ascii="Calibri" w:eastAsia="华文细黑" w:hAnsi="Calibri" w:cs="Calibri" w:hint="eastAsia"/>
+          <w:color w:val="404040" w:themeColor="text1" w:themeTint="BF"/>
+          <w:szCs w:val="21"/>
+        </w:rPr>
+        <w:t>等前端技术，具备前端开发能力</w:t>
+      </w:r>
+      <w:r>
+        <w:rPr>
+          <w:rFonts w:ascii="Calibri" w:eastAsia="华文细黑" w:hAnsi="Calibri" w:cs="Calibri"/>
+          <w:color w:val="404040" w:themeColor="text1" w:themeTint="BF"/>
+          <w:szCs w:val="21"/>
+        </w:rPr>
+        <w:t>，可独立完成前后端联调</w:t>
       </w:r>
     </w:p>
     <w:p>
@@ -1412,6 +1436,70 @@
         <w:spacing w:line="320" w:lineRule="exact"/>
         <w:ind w:left="357" w:firstLineChars="0" w:hanging="357"/>
         <w:rPr>
+          <w:rFonts w:ascii="Calibri" w:eastAsia="华文细黑" w:hAnsi="Calibri" w:cs="Calibri" w:hint="eastAsia"/>
+          <w:color w:val="404040" w:themeColor="text1" w:themeTint="BF"/>
+          <w:szCs w:val="21"/>
+        </w:rPr>
+      </w:pPr>
+      <w:r>
+        <w:rPr>
+          <w:rFonts w:ascii="Calibri" w:eastAsia="华文细黑" w:hAnsi="Calibri" w:cs="Calibri" w:hint="eastAsia"/>
+          <w:color w:val="404040" w:themeColor="text1" w:themeTint="BF"/>
+          <w:szCs w:val="21"/>
+        </w:rPr>
+        <w:t>熟悉</w:t>
+      </w:r>
+      <w:r>
+        <w:rPr>
+          <w:rFonts w:ascii="Calibri" w:eastAsia="华文细黑" w:hAnsi="Calibri" w:cs="Calibri" w:hint="eastAsia"/>
+          <w:color w:val="404040" w:themeColor="text1" w:themeTint="BF"/>
+          <w:szCs w:val="21"/>
+        </w:rPr>
+        <w:t>python</w:t>
+      </w:r>
+      <w:r>
+        <w:rPr>
+          <w:rFonts w:ascii="Calibri" w:eastAsia="华文细黑" w:hAnsi="Calibri" w:cs="Calibri" w:hint="eastAsia"/>
+          <w:color w:val="404040" w:themeColor="text1" w:themeTint="BF"/>
+          <w:szCs w:val="21"/>
+        </w:rPr>
+        <w:t>、</w:t>
+      </w:r>
+      <w:r>
+        <w:rPr>
+          <w:rFonts w:ascii="Calibri" w:eastAsia="华文细黑" w:hAnsi="Calibri" w:cs="Calibri" w:hint="eastAsia"/>
+          <w:color w:val="404040" w:themeColor="text1" w:themeTint="BF"/>
+          <w:szCs w:val="21"/>
+        </w:rPr>
+        <w:t>bash</w:t>
+      </w:r>
+      <w:r>
+        <w:rPr>
+          <w:rFonts w:ascii="Calibri" w:eastAsia="华文细黑" w:hAnsi="Calibri" w:cs="Calibri" w:hint="eastAsia"/>
+          <w:color w:val="404040" w:themeColor="text1" w:themeTint="BF"/>
+          <w:szCs w:val="21"/>
+        </w:rPr>
+        <w:t>脚本语言，</w:t>
+      </w:r>
+      <w:r>
+        <w:rPr>
+          <w:rFonts w:ascii="Calibri" w:eastAsia="华文细黑" w:hAnsi="Calibri" w:cs="Calibri"/>
+          <w:color w:val="404040" w:themeColor="text1" w:themeTint="BF"/>
+          <w:szCs w:val="21"/>
+        </w:rPr>
+        <w:t>可用于工具开发与辅助系统建设</w:t>
+      </w:r>
+    </w:p>
+    <w:p>
+      <w:pPr>
+        <w:pStyle w:val="a3"/>
+        <w:numPr>
+          <w:ilvl w:val="0"/>
+          <w:numId w:val="10"/>
+        </w:numPr>
+        <w:spacing w:line="320" w:lineRule="exact"/>
+        <w:ind w:left="357" w:firstLineChars="0" w:hanging="357"/>
+        <w:rPr>
           <w:rFonts w:ascii="Calibri" w:eastAsia="华文细黑" w:hAnsi="Calibri" w:cs="Calibri"/>
           <w:color w:val="404040" w:themeColor="text1" w:themeTint="BF"/>
           <w:szCs w:val="21"/>
@@ -1439,7 +1527,55 @@
           <w:color w:val="404040" w:themeColor="text1" w:themeTint="BF"/>
           <w:szCs w:val="21"/>
         </w:rPr>
-        <w:t>命令，能对线上问题进行排查，快速定位问题原因</w:t>
+        <w:t>命令</w:t>
+      </w:r>
+      <w:r>
+        <w:rPr>
+          <w:rFonts w:ascii="Calibri" w:eastAsia="华文细黑" w:hAnsi="Calibri" w:cs="Calibri"/>
+          <w:color w:val="404040" w:themeColor="text1" w:themeTint="BF"/>
+          <w:szCs w:val="21"/>
+        </w:rPr>
+        <w:t>及线上问题排查</w:t>
+      </w:r>
+    </w:p>
+    <w:p>
+      <w:pPr>
+        <w:pStyle w:val="a3"/>
+        <w:numPr>
+          <w:ilvl w:val="0"/>
+          <w:numId w:val="10"/>
+        </w:numPr>
+        <w:spacing w:line="320" w:lineRule="exact"/>
+        <w:ind w:left="357" w:firstLineChars="0" w:hanging="357"/>
+        <w:rPr>
+          <w:rFonts w:ascii="Calibri" w:eastAsia="华文细黑" w:hAnsi="Calibri" w:cs="Calibri"/>
+          <w:color w:val="404040" w:themeColor="text1" w:themeTint="BF"/>
+          <w:szCs w:val="21"/>
+        </w:rPr>
+      </w:pPr>
+      <w:r>
+        <w:rPr>
+          <w:rFonts w:ascii="Calibri" w:eastAsia="华文细黑" w:hAnsi="Calibri" w:cs="Calibri"/>
+          <w:color w:val="404040" w:themeColor="text1" w:themeTint="BF"/>
+          <w:szCs w:val="21"/>
+        </w:rPr>
+        <w:t>具备良好的跨团队沟通能力</w:t>
+      </w:r>
+      <w:r>
+        <w:rPr>
+          <w:rFonts w:ascii="Calibri" w:eastAsia="华文细黑" w:hAnsi="Calibri" w:cs="Calibri"/>
+          <w:color w:val="404040" w:themeColor="text1" w:themeTint="BF"/>
+          <w:szCs w:val="21"/>
+        </w:rPr>
+        <w:t>与技术带队经验</w:t>
+      </w:r>
+      <w:r>
+        <w:rPr>
+          <w:rFonts w:ascii="Calibri" w:eastAsia="华文细黑" w:hAnsi="Calibri" w:cs="Calibri"/>
+          <w:color w:val="404040" w:themeColor="text1" w:themeTint="BF"/>
+          <w:szCs w:val="21"/>
+        </w:rPr>
+        <w:t>，能够推动复杂系统落地</w:t>
       </w:r>
     </w:p>
     <w:p>
@@ -2323,7 +2459,15 @@
           <w:color w:val="404040" w:themeColor="text1" w:themeTint="BF"/>
           <w:szCs w:val="21"/>
         </w:rPr>
-        <w:t>编写风控接入</w:t>
+        <w:t>输出</w:t>
+      </w:r>
+      <w:r>
+        <w:rPr>
+          <w:rFonts w:ascii="Calibri" w:eastAsia="华文细黑" w:hAnsi="Calibri" w:cs="Calibri" w:hint="eastAsia"/>
+          <w:color w:val="404040" w:themeColor="text1" w:themeTint="BF"/>
+          <w:szCs w:val="21"/>
+        </w:rPr>
+        <w:t>风控接入</w:t>
       </w:r>
       <w:r>
         <w:rPr>
@@ -2467,6 +2611,22 @@
           <w:color w:val="404040" w:themeColor="text1" w:themeTint="BF"/>
           <w:szCs w:val="21"/>
         </w:rPr>
+        <w:t>包括机审、人审、红蓝对抗、端侧敏感词</w:t>
+      </w:r>
+      <w:r>
+        <w:rPr>
+          <w:rFonts w:ascii="Calibri" w:eastAsia="华文细黑" w:hAnsi="Calibri" w:cs="Calibri" w:hint="eastAsia"/>
+          <w:color w:val="404040" w:themeColor="text1" w:themeTint="BF"/>
+          <w:szCs w:val="21"/>
+        </w:rPr>
+        <w:t>能力，实现审核、对抗、运营能力闭环，</w:t>
+      </w:r>
+      <w:r>
+        <w:rPr>
+          <w:rFonts w:ascii="Calibri" w:eastAsia="华文细黑" w:hAnsi="Calibri" w:cs="Calibri" w:hint="eastAsia"/>
+          <w:color w:val="404040" w:themeColor="text1" w:themeTint="BF"/>
+          <w:szCs w:val="21"/>
+        </w:rPr>
         <w:t>获得一级部门中心化建设团队大事件奖</w:t>
       </w:r>
       <w:r>
@@ -2483,7 +2643,23 @@
           <w:color w:val="404040" w:themeColor="text1" w:themeTint="BF"/>
           <w:szCs w:val="21"/>
         </w:rPr>
-        <w:t>已在中国、俄罗斯、亚太、欧洲部署上线。</w:t>
+        <w:t>在中国、俄罗斯、亚太、欧洲</w:t>
+      </w:r>
+      <w:r>
+        <w:rPr>
+          <w:rFonts w:ascii="Calibri" w:eastAsia="华文细黑" w:hAnsi="Calibri" w:cs="Calibri" w:hint="eastAsia"/>
+          <w:color w:val="404040" w:themeColor="text1" w:themeTint="BF"/>
+          <w:szCs w:val="21"/>
+        </w:rPr>
+        <w:t>四大区</w:t>
+      </w:r>
+      <w:r>
+        <w:rPr>
+          <w:rFonts w:ascii="Calibri" w:eastAsia="华文细黑" w:hAnsi="Calibri" w:cs="Calibri" w:hint="eastAsia"/>
+          <w:color w:val="404040" w:themeColor="text1" w:themeTint="BF"/>
+          <w:szCs w:val="21"/>
+        </w:rPr>
+        <w:t>部署上线。</w:t>
       </w:r>
       <w:r>
         <w:rPr>
@@ -2843,47 +3019,168 @@
           <w:color w:val="404040" w:themeColor="text1" w:themeTint="BF"/>
           <w:szCs w:val="21"/>
         </w:rPr>
-        <w:t>主导完成红蓝对抗、人审平台建设及端侧敏感词</w:t>
-      </w:r>
-      <w:r>
-        <w:rPr>
-          <w:rFonts w:ascii="Calibri" w:eastAsia="华文细黑" w:hAnsi="Calibri" w:cs="Calibri" w:hint="eastAsia"/>
-          <w:color w:val="404040" w:themeColor="text1" w:themeTint="BF"/>
-          <w:szCs w:val="21"/>
-        </w:rPr>
-        <w:t>SDK</w:t>
-      </w:r>
-      <w:r>
-        <w:rPr>
-          <w:rFonts w:ascii="Calibri" w:eastAsia="华文细黑" w:hAnsi="Calibri" w:cs="Calibri" w:hint="eastAsia"/>
-          <w:color w:val="404040" w:themeColor="text1" w:themeTint="BF"/>
-          <w:szCs w:val="21"/>
-        </w:rPr>
-        <w:t>支持，</w:t>
-      </w:r>
-      <w:r>
-        <w:rPr>
-          <w:rFonts w:ascii="Calibri" w:eastAsia="华文细黑" w:hAnsi="Calibri" w:cs="Calibri" w:hint="eastAsia"/>
-          <w:color w:val="404040" w:themeColor="text1" w:themeTint="BF"/>
-          <w:szCs w:val="21"/>
-        </w:rPr>
-        <w:t>实现从机审、人审、端侧、红蓝对抗</w:t>
-      </w:r>
-      <w:r>
-        <w:rPr>
-          <w:rFonts w:ascii="Calibri" w:eastAsia="华文细黑" w:hAnsi="Calibri" w:cs="Calibri" w:hint="eastAsia"/>
-          <w:color w:val="404040" w:themeColor="text1" w:themeTint="BF"/>
-          <w:szCs w:val="21"/>
-        </w:rPr>
-        <w:t>、运营等</w:t>
-      </w:r>
-      <w:r>
-        <w:rPr>
-          <w:rFonts w:ascii="Calibri" w:eastAsia="华文细黑" w:hAnsi="Calibri" w:cs="Calibri" w:hint="eastAsia"/>
-          <w:color w:val="404040" w:themeColor="text1" w:themeTint="BF"/>
-          <w:szCs w:val="21"/>
-        </w:rPr>
-        <w:t>内容风控全流程能力闭环</w:t>
+        <w:t>作为</w:t>
+      </w:r>
+      <w:r>
+        <w:rPr>
+          <w:rFonts w:ascii="Calibri" w:eastAsia="华文细黑" w:hAnsi="Calibri" w:cs="Calibri" w:hint="eastAsia"/>
+          <w:color w:val="404040" w:themeColor="text1" w:themeTint="BF"/>
+          <w:szCs w:val="21"/>
+        </w:rPr>
+        <w:t>交易风控规则引擎、人机识别、离线筛单、信誉分</w:t>
+      </w:r>
+      <w:r>
+        <w:rPr>
+          <w:rFonts w:ascii="Calibri" w:eastAsia="华文细黑" w:hAnsi="Calibri" w:cs="Calibri" w:hint="eastAsia"/>
+          <w:color w:val="404040" w:themeColor="text1" w:themeTint="BF"/>
+          <w:szCs w:val="21"/>
+        </w:rPr>
+        <w:t>核心设计和开发人员，完成交易</w:t>
+      </w:r>
+      <w:r>
+        <w:rPr>
+          <w:rFonts w:ascii="Calibri" w:eastAsia="华文细黑" w:hAnsi="Calibri" w:cs="Calibri" w:hint="eastAsia"/>
+          <w:color w:val="404040" w:themeColor="text1" w:themeTint="BF"/>
+          <w:szCs w:val="21"/>
+        </w:rPr>
+        <w:lastRenderedPageBreak/>
+        <w:t>风控</w:t>
+      </w:r>
+      <w:r>
+        <w:rPr>
+          <w:rFonts w:ascii="Calibri" w:eastAsia="华文细黑" w:hAnsi="Calibri" w:cs="Calibri" w:hint="eastAsia"/>
+          <w:color w:val="404040" w:themeColor="text1" w:themeTint="BF"/>
+          <w:szCs w:val="21"/>
+        </w:rPr>
+        <w:t>能力建设，</w:t>
+      </w:r>
+      <w:r>
+        <w:rPr>
+          <w:rFonts w:ascii="Calibri" w:eastAsia="华文细黑" w:hAnsi="Calibri" w:cs="Calibri" w:hint="eastAsia"/>
+          <w:color w:val="404040" w:themeColor="text1" w:themeTint="BF"/>
+          <w:szCs w:val="21"/>
+        </w:rPr>
+        <w:t>具备风控产品快速复制能力，已在中国区、亚太、欧洲部署。</w:t>
+      </w:r>
+      <w:r>
+        <w:rPr>
+          <w:rFonts w:ascii="Calibri" w:eastAsia="华文细黑" w:hAnsi="Calibri" w:cs="Calibri" w:hint="eastAsia"/>
+          <w:color w:val="404040" w:themeColor="text1" w:themeTint="BF"/>
+          <w:szCs w:val="21"/>
+        </w:rPr>
+        <w:t>为</w:t>
+      </w:r>
+      <w:r>
+        <w:rPr>
+          <w:rFonts w:ascii="Calibri" w:eastAsia="华文细黑" w:hAnsi="Calibri" w:cs="Calibri" w:hint="eastAsia"/>
+          <w:color w:val="404040" w:themeColor="text1" w:themeTint="BF"/>
+          <w:szCs w:val="21"/>
+        </w:rPr>
+        <w:t>流程</w:t>
+      </w:r>
+      <w:r>
+        <w:rPr>
+          <w:rFonts w:ascii="Calibri" w:eastAsia="华文细黑" w:hAnsi="Calibri" w:cs="Calibri" w:hint="eastAsia"/>
+          <w:color w:val="404040" w:themeColor="text1" w:themeTint="BF"/>
+          <w:szCs w:val="21"/>
+        </w:rPr>
+        <w:t>IT</w:t>
+      </w:r>
+      <w:r>
+        <w:rPr>
+          <w:rFonts w:ascii="Calibri" w:eastAsia="华文细黑" w:hAnsi="Calibri" w:cs="Calibri" w:hint="eastAsia"/>
+          <w:color w:val="404040" w:themeColor="text1" w:themeTint="BF"/>
+          <w:szCs w:val="21"/>
+        </w:rPr>
+        <w:t>、</w:t>
+      </w:r>
+      <w:r>
+        <w:rPr>
+          <w:rFonts w:ascii="Calibri" w:eastAsia="华文细黑" w:hAnsi="Calibri" w:cs="Calibri" w:hint="eastAsia"/>
+          <w:color w:val="404040" w:themeColor="text1" w:themeTint="BF"/>
+          <w:szCs w:val="21"/>
+        </w:rPr>
+        <w:t>研发管理部、</w:t>
+      </w:r>
+      <w:r>
+        <w:rPr>
+          <w:rFonts w:ascii="Calibri" w:eastAsia="华文细黑" w:hAnsi="Calibri" w:cs="Calibri" w:hint="eastAsia"/>
+          <w:color w:val="404040" w:themeColor="text1" w:themeTint="BF"/>
+          <w:szCs w:val="21"/>
+        </w:rPr>
+        <w:t>云服务</w:t>
+      </w:r>
+      <w:r>
+        <w:rPr>
+          <w:rFonts w:ascii="Calibri" w:eastAsia="华文细黑" w:hAnsi="Calibri" w:cs="Calibri" w:hint="eastAsia"/>
+          <w:color w:val="404040" w:themeColor="text1" w:themeTint="BF"/>
+          <w:szCs w:val="21"/>
+        </w:rPr>
+        <w:t>部门的荣耀商城、亲选商城、内购商城、运动健康、</w:t>
+      </w:r>
+      <w:r>
+        <w:rPr>
+          <w:rFonts w:ascii="Calibri" w:eastAsia="华文细黑" w:hAnsi="Calibri" w:cs="Calibri" w:hint="eastAsia"/>
+          <w:color w:val="404040" w:themeColor="text1" w:themeTint="BF"/>
+          <w:szCs w:val="21"/>
+        </w:rPr>
+        <w:t>MyHonor</w:t>
+      </w:r>
+      <w:r>
+        <w:rPr>
+          <w:rFonts w:ascii="Calibri" w:eastAsia="华文细黑" w:hAnsi="Calibri" w:cs="Calibri" w:hint="eastAsia"/>
+          <w:color w:val="404040" w:themeColor="text1" w:themeTint="BF"/>
+          <w:szCs w:val="21"/>
+        </w:rPr>
+        <w:t>等</w:t>
+      </w:r>
+      <w:r>
+        <w:rPr>
+          <w:rFonts w:ascii="Calibri" w:eastAsia="华文细黑" w:hAnsi="Calibri" w:cs="Calibri" w:hint="eastAsia"/>
+          <w:color w:val="404040" w:themeColor="text1" w:themeTint="BF"/>
+          <w:szCs w:val="21"/>
+        </w:rPr>
+        <w:t>10+</w:t>
+      </w:r>
+      <w:r>
+        <w:rPr>
+          <w:rFonts w:ascii="Calibri" w:eastAsia="华文细黑" w:hAnsi="Calibri" w:cs="Calibri" w:hint="eastAsia"/>
+          <w:color w:val="404040" w:themeColor="text1" w:themeTint="BF"/>
+          <w:szCs w:val="21"/>
+        </w:rPr>
+        <w:t>业务</w:t>
+      </w:r>
+      <w:r>
+        <w:rPr>
+          <w:rFonts w:ascii="Calibri" w:eastAsia="华文细黑" w:hAnsi="Calibri" w:cs="Calibri" w:hint="eastAsia"/>
+          <w:color w:val="404040" w:themeColor="text1" w:themeTint="BF"/>
+          <w:szCs w:val="21"/>
+        </w:rPr>
+        <w:t>5</w:t>
+      </w:r>
+      <w:r>
+        <w:rPr>
+          <w:rFonts w:ascii="Calibri" w:eastAsia="华文细黑" w:hAnsi="Calibri" w:cs="Calibri" w:hint="eastAsia"/>
+          <w:color w:val="404040" w:themeColor="text1" w:themeTint="BF"/>
+          <w:szCs w:val="21"/>
+        </w:rPr>
+        <w:t>0+</w:t>
+      </w:r>
+      <w:r>
+        <w:rPr>
+          <w:rFonts w:ascii="Calibri" w:eastAsia="华文细黑" w:hAnsi="Calibri" w:cs="Calibri" w:hint="eastAsia"/>
+          <w:color w:val="404040" w:themeColor="text1" w:themeTint="BF"/>
+          <w:szCs w:val="21"/>
+        </w:rPr>
+        <w:t>场景的提供用户风险识别</w:t>
+      </w:r>
+      <w:r>
+        <w:rPr>
+          <w:rFonts w:ascii="Calibri" w:eastAsia="华文细黑" w:hAnsi="Calibri" w:cs="Calibri" w:hint="eastAsia"/>
+          <w:color w:val="404040" w:themeColor="text1" w:themeTint="BF"/>
+          <w:szCs w:val="21"/>
+        </w:rPr>
+        <w:t>能力</w:t>
       </w:r>
     </w:p>
     <w:p>
@@ -2907,47 +3204,87 @@
           <w:color w:val="404040" w:themeColor="text1" w:themeTint="BF"/>
           <w:szCs w:val="21"/>
         </w:rPr>
-        <w:t>作为</w:t>
-      </w:r>
-      <w:r>
-        <w:rPr>
-          <w:rFonts w:ascii="Calibri" w:eastAsia="华文细黑" w:hAnsi="Calibri" w:cs="Calibri" w:hint="eastAsia"/>
-          <w:color w:val="404040" w:themeColor="text1" w:themeTint="BF"/>
-          <w:szCs w:val="21"/>
-        </w:rPr>
-        <w:t>交易风控规则引擎、人机识别、离线筛单、信誉分</w:t>
-      </w:r>
-      <w:r>
-        <w:rPr>
-          <w:rFonts w:ascii="Calibri" w:eastAsia="华文细黑" w:hAnsi="Calibri" w:cs="Calibri" w:hint="eastAsia"/>
-          <w:color w:val="404040" w:themeColor="text1" w:themeTint="BF"/>
-          <w:szCs w:val="21"/>
-        </w:rPr>
-        <w:t>核心设计和开发人员，完成交易风控</w:t>
-      </w:r>
-      <w:r>
-        <w:rPr>
-          <w:rFonts w:ascii="Calibri" w:eastAsia="华文细黑" w:hAnsi="Calibri" w:cs="Calibri" w:hint="eastAsia"/>
-          <w:color w:val="404040" w:themeColor="text1" w:themeTint="BF"/>
-          <w:szCs w:val="21"/>
-        </w:rPr>
-        <w:t>能力建设，</w:t>
-      </w:r>
-      <w:r>
-        <w:rPr>
-          <w:rFonts w:ascii="Calibri" w:eastAsia="华文细黑" w:hAnsi="Calibri" w:cs="Calibri" w:hint="eastAsia"/>
-          <w:color w:val="404040" w:themeColor="text1" w:themeTint="BF"/>
-          <w:szCs w:val="21"/>
-        </w:rPr>
-        <w:t>具备</w:t>
-      </w:r>
-      <w:r>
-        <w:rPr>
-          <w:rFonts w:ascii="Calibri" w:eastAsia="华文细黑" w:hAnsi="Calibri" w:cs="Calibri" w:hint="eastAsia"/>
-          <w:color w:val="404040" w:themeColor="text1" w:themeTint="BF"/>
-          <w:szCs w:val="21"/>
-        </w:rPr>
-        <w:t>风控产品快速复制能力</w:t>
+        <w:t>负责风控需求</w:t>
+      </w:r>
+      <w:r>
+        <w:rPr>
+          <w:rFonts w:ascii="Calibri" w:eastAsia="华文细黑" w:hAnsi="Calibri" w:cs="Calibri" w:hint="eastAsia"/>
+          <w:color w:val="404040" w:themeColor="text1" w:themeTint="BF"/>
+          <w:szCs w:val="21"/>
+        </w:rPr>
+        <w:t>人力</w:t>
+      </w:r>
+      <w:r>
+        <w:rPr>
+          <w:rFonts w:ascii="Calibri" w:eastAsia="华文细黑" w:hAnsi="Calibri" w:cs="Calibri" w:hint="eastAsia"/>
+          <w:color w:val="404040" w:themeColor="text1" w:themeTint="BF"/>
+          <w:szCs w:val="21"/>
+        </w:rPr>
+        <w:t>评估、</w:t>
+      </w:r>
+      <w:r>
+        <w:rPr>
+          <w:rFonts w:ascii="Calibri" w:eastAsia="华文细黑" w:hAnsi="Calibri" w:cs="Calibri" w:hint="eastAsia"/>
+          <w:color w:val="404040" w:themeColor="text1" w:themeTint="BF"/>
+          <w:szCs w:val="21"/>
+        </w:rPr>
+        <w:t>版本</w:t>
+      </w:r>
+      <w:r>
+        <w:rPr>
+          <w:rFonts w:ascii="Calibri" w:eastAsia="华文细黑" w:hAnsi="Calibri" w:cs="Calibri" w:hint="eastAsia"/>
+          <w:color w:val="404040" w:themeColor="text1" w:themeTint="BF"/>
+          <w:szCs w:val="21"/>
+        </w:rPr>
+        <w:t>交付</w:t>
+      </w:r>
+      <w:r>
+        <w:rPr>
+          <w:rFonts w:ascii="Calibri" w:eastAsia="华文细黑" w:hAnsi="Calibri" w:cs="Calibri" w:hint="eastAsia"/>
+          <w:color w:val="404040" w:themeColor="text1" w:themeTint="BF"/>
+          <w:szCs w:val="21"/>
+        </w:rPr>
+        <w:t>、质量管控，</w:t>
+      </w:r>
+      <w:r>
+        <w:rPr>
+          <w:rFonts w:ascii="Calibri" w:eastAsia="华文细黑" w:hAnsi="Calibri" w:cs="Calibri" w:hint="eastAsia"/>
+          <w:color w:val="404040" w:themeColor="text1" w:themeTint="BF"/>
+          <w:szCs w:val="21"/>
+        </w:rPr>
+        <w:t>对风险及时识别</w:t>
+      </w:r>
+      <w:r>
+        <w:rPr>
+          <w:rFonts w:ascii="Calibri" w:eastAsia="华文细黑" w:hAnsi="Calibri" w:cs="Calibri" w:hint="eastAsia"/>
+          <w:color w:val="404040" w:themeColor="text1" w:themeTint="BF"/>
+          <w:szCs w:val="21"/>
+        </w:rPr>
+        <w:t>、</w:t>
+      </w:r>
+      <w:r>
+        <w:rPr>
+          <w:rFonts w:ascii="Calibri" w:eastAsia="华文细黑" w:hAnsi="Calibri" w:cs="Calibri" w:hint="eastAsia"/>
+          <w:color w:val="404040" w:themeColor="text1" w:themeTint="BF"/>
+          <w:szCs w:val="21"/>
+        </w:rPr>
+        <w:t>预警</w:t>
+      </w:r>
+      <w:r>
+        <w:rPr>
+          <w:rFonts w:ascii="Calibri" w:eastAsia="华文细黑" w:hAnsi="Calibri" w:cs="Calibri" w:hint="eastAsia"/>
+          <w:color w:val="404040" w:themeColor="text1" w:themeTint="BF"/>
+          <w:szCs w:val="21"/>
+        </w:rPr>
+        <w:t>及处理，保障</w:t>
+      </w:r>
+      <w:r>
+        <w:rPr>
+          <w:rFonts w:ascii="Calibri" w:eastAsia="华文细黑" w:hAnsi="Calibri" w:cs="Calibri" w:hint="eastAsia"/>
+          <w:color w:val="404040" w:themeColor="text1" w:themeTint="BF"/>
+          <w:szCs w:val="21"/>
+        </w:rPr>
+        <w:t>版本按时高质量交付</w:t>
       </w:r>
       <w:r>
         <w:rPr>
@@ -2963,7 +3300,286 @@
           <w:color w:val="404040" w:themeColor="text1" w:themeTint="BF"/>
           <w:szCs w:val="21"/>
         </w:rPr>
-        <w:t>已在中国区、亚太、欧洲部署。</w:t>
+        <w:t>代码质量不高于</w:t>
+      </w:r>
+      <w:r>
+        <w:rPr>
+          <w:rFonts w:ascii="Calibri" w:eastAsia="华文细黑" w:hAnsi="Calibri" w:cs="Calibri" w:hint="eastAsia"/>
+          <w:color w:val="404040" w:themeColor="text1" w:themeTint="BF"/>
+          <w:szCs w:val="21"/>
+        </w:rPr>
+        <w:t>L2</w:t>
+      </w:r>
+      <w:r>
+        <w:rPr>
+          <w:rFonts w:ascii="Calibri" w:eastAsia="华文细黑" w:hAnsi="Calibri" w:cs="Calibri" w:hint="eastAsia"/>
+          <w:color w:val="404040" w:themeColor="text1" w:themeTint="BF"/>
+          <w:szCs w:val="21"/>
+        </w:rPr>
+        <w:t>，</w:t>
+      </w:r>
+      <w:r>
+        <w:rPr>
+          <w:rFonts w:ascii="Calibri" w:eastAsia="华文细黑" w:hAnsi="Calibri" w:cs="Calibri" w:hint="eastAsia"/>
+          <w:color w:val="404040" w:themeColor="text1" w:themeTint="BF"/>
+          <w:szCs w:val="21"/>
+        </w:rPr>
+        <w:t>研发缺陷密度不高于</w:t>
+      </w:r>
+      <w:r>
+        <w:rPr>
+          <w:rFonts w:ascii="Calibri" w:eastAsia="华文细黑" w:hAnsi="Calibri" w:cs="Calibri" w:hint="eastAsia"/>
+          <w:color w:val="404040" w:themeColor="text1" w:themeTint="BF"/>
+          <w:szCs w:val="21"/>
+        </w:rPr>
+        <w:t>2.5</w:t>
+      </w:r>
+      <w:r>
+        <w:rPr>
+          <w:rFonts w:ascii="Calibri" w:eastAsia="华文细黑" w:hAnsi="Calibri" w:cs="Calibri" w:hint="eastAsia"/>
+          <w:color w:val="404040" w:themeColor="text1" w:themeTint="BF"/>
+          <w:szCs w:val="21"/>
+        </w:rPr>
+        <w:t>，</w:t>
+      </w:r>
+      <w:r>
+        <w:rPr>
+          <w:rFonts w:ascii="Calibri" w:eastAsia="华文细黑" w:hAnsi="Calibri" w:cs="Calibri" w:hint="eastAsia"/>
+          <w:color w:val="404040" w:themeColor="text1" w:themeTint="BF"/>
+          <w:szCs w:val="21"/>
+        </w:rPr>
+        <w:t>多次上月度红榜。</w:t>
+      </w:r>
+      <w:r>
+        <w:rPr>
+          <w:rFonts w:ascii="Calibri" w:eastAsia="华文细黑" w:hAnsi="Calibri" w:cs="Calibri" w:hint="eastAsia"/>
+          <w:color w:val="404040" w:themeColor="text1" w:themeTint="BF"/>
+          <w:szCs w:val="21"/>
+        </w:rPr>
+        <w:t>个人多次被评选为月度之星</w:t>
+      </w:r>
+    </w:p>
+    <w:p>
+      <w:pPr>
+        <w:spacing w:line="400" w:lineRule="exact"/>
+        <w:rPr>
+          <w:rFonts w:ascii="Calibri" w:eastAsia="华文细黑" w:hAnsi="Calibri" w:cs="Calibri"/>
+          <w:b/>
+          <w:bCs/>
+          <w:color w:val="404040" w:themeColor="text1" w:themeTint="BF"/>
+          <w:sz w:val="24"/>
+          <w:szCs w:val="24"/>
+        </w:rPr>
+      </w:pPr>
+      <w:r>
+        <w:rPr>
+          <w:rFonts w:ascii="Calibri" w:eastAsia="华文细黑" w:hAnsi="Calibri" w:cs="Calibri" w:hint="eastAsia"/>
+          <w:b/>
+          <w:bCs/>
+          <w:color w:val="404040" w:themeColor="text1" w:themeTint="BF"/>
+          <w:sz w:val="24"/>
+          <w:szCs w:val="24"/>
+        </w:rPr>
+        <w:t>项目经历</w:t>
+      </w:r>
+      <w:r>
+        <w:rPr>
+          <w:rFonts w:ascii="Calibri" w:eastAsia="华文细黑" w:hAnsi="Calibri" w:cs="Calibri" w:hint="eastAsia"/>
+          <w:b/>
+          <w:bCs/>
+          <w:color w:val="404040" w:themeColor="text1" w:themeTint="BF"/>
+          <w:sz w:val="24"/>
+          <w:szCs w:val="24"/>
+        </w:rPr>
+        <w:t>：</w:t>
+      </w:r>
+    </w:p>
+    <w:p>
+      <w:pPr>
+        <w:spacing w:line="320" w:lineRule="exact"/>
+        <w:rPr>
+          <w:rFonts w:ascii="Calibri" w:eastAsia="华文细黑" w:hAnsi="Calibri" w:cs="Calibri"/>
+          <w:b/>
+          <w:bCs/>
+          <w:color w:val="404040" w:themeColor="text1" w:themeTint="BF"/>
+          <w:szCs w:val="21"/>
+        </w:rPr>
+      </w:pPr>
+      <w:r>
+        <w:rPr>
+          <w:rFonts w:ascii="Calibri" w:eastAsia="华文细黑" w:hAnsi="Calibri" w:cs="Calibri" w:hint="eastAsia"/>
+          <w:b/>
+          <w:bCs/>
+          <w:color w:val="404040" w:themeColor="text1" w:themeTint="BF"/>
+          <w:szCs w:val="21"/>
+        </w:rPr>
+        <w:t>项目</w:t>
+      </w:r>
+      <w:r>
+        <w:rPr>
+          <w:rFonts w:ascii="Calibri" w:eastAsia="华文细黑" w:hAnsi="Calibri" w:cs="Calibri" w:hint="eastAsia"/>
+          <w:b/>
+          <w:bCs/>
+          <w:color w:val="404040" w:themeColor="text1" w:themeTint="BF"/>
+          <w:szCs w:val="21"/>
+        </w:rPr>
+        <w:t>一：</w:t>
+      </w:r>
+      <w:r>
+        <w:rPr>
+          <w:rFonts w:ascii="Calibri" w:eastAsia="华文细黑" w:hAnsi="Calibri" w:cs="Calibri" w:hint="eastAsia"/>
+          <w:b/>
+          <w:bCs/>
+          <w:color w:val="404040" w:themeColor="text1" w:themeTint="BF"/>
+          <w:szCs w:val="21"/>
+        </w:rPr>
+        <w:t>内容风控中心化建设</w:t>
+      </w:r>
+    </w:p>
+    <w:p>
+      <w:pPr>
+        <w:spacing w:line="320" w:lineRule="exact"/>
+        <w:rPr>
+          <w:rFonts w:ascii="Calibri" w:eastAsia="华文细黑" w:hAnsi="Calibri" w:cs="Calibri"/>
+          <w:b/>
+          <w:bCs/>
+          <w:color w:val="404040" w:themeColor="text1" w:themeTint="BF"/>
+          <w:szCs w:val="21"/>
+        </w:rPr>
+      </w:pPr>
+      <w:r>
+        <w:rPr>
+          <w:rFonts w:ascii="Calibri" w:eastAsia="华文细黑" w:hAnsi="Calibri" w:cs="Calibri" w:hint="eastAsia"/>
+          <w:b/>
+          <w:bCs/>
+          <w:color w:val="404040" w:themeColor="text1" w:themeTint="BF"/>
+          <w:szCs w:val="21"/>
+        </w:rPr>
+        <w:t>项目介绍：</w:t>
+      </w:r>
+    </w:p>
+    <w:p>
+      <w:pPr>
+        <w:spacing w:line="320" w:lineRule="exact"/>
+        <w:rPr>
+          <w:rFonts w:ascii="Calibri" w:eastAsia="华文细黑" w:hAnsi="Calibri" w:cs="Calibri"/>
+          <w:color w:val="404040" w:themeColor="text1" w:themeTint="BF"/>
+          <w:szCs w:val="21"/>
+        </w:rPr>
+      </w:pPr>
+      <w:r>
+        <w:rPr>
+          <w:rFonts w:ascii="Calibri" w:eastAsia="华文细黑" w:hAnsi="Calibri" w:cs="Calibri"/>
+          <w:b/>
+          <w:bCs/>
+          <w:color w:val="404040" w:themeColor="text1" w:themeTint="BF"/>
+          <w:szCs w:val="21"/>
+        </w:rPr>
+        <w:tab/>
+      </w:r>
+      <w:r>
+        <w:rPr>
+          <w:rFonts w:ascii="Calibri" w:eastAsia="华文细黑" w:hAnsi="Calibri" w:cs="Calibri" w:hint="eastAsia"/>
+          <w:color w:val="404040" w:themeColor="text1" w:themeTint="BF"/>
+          <w:szCs w:val="21"/>
+        </w:rPr>
+        <w:t>建设荣耀公司统一的内容风控中心，</w:t>
+      </w:r>
+      <w:r>
+        <w:rPr>
+          <w:rFonts w:ascii="Calibri" w:eastAsia="华文细黑" w:hAnsi="Calibri" w:cs="Calibri" w:hint="eastAsia"/>
+          <w:color w:val="404040" w:themeColor="text1" w:themeTint="BF"/>
+          <w:szCs w:val="21"/>
+        </w:rPr>
+        <w:t>提供图、文、音、视、文件、</w:t>
+      </w:r>
+      <w:r>
+        <w:rPr>
+          <w:rFonts w:ascii="Calibri" w:eastAsia="华文细黑" w:hAnsi="Calibri" w:cs="Calibri" w:hint="eastAsia"/>
+          <w:color w:val="404040" w:themeColor="text1" w:themeTint="BF"/>
+          <w:szCs w:val="21"/>
+        </w:rPr>
+        <w:t>web</w:t>
+      </w:r>
+      <w:r>
+        <w:rPr>
+          <w:rFonts w:ascii="Calibri" w:eastAsia="华文细黑" w:hAnsi="Calibri" w:cs="Calibri" w:hint="eastAsia"/>
+          <w:color w:val="404040" w:themeColor="text1" w:themeTint="BF"/>
+          <w:szCs w:val="21"/>
+        </w:rPr>
+        <w:t>等内容审核能力</w:t>
+      </w:r>
+      <w:r>
+        <w:rPr>
+          <w:rFonts w:ascii="Calibri" w:eastAsia="华文细黑" w:hAnsi="Calibri" w:cs="Calibri" w:hint="eastAsia"/>
+          <w:color w:val="404040" w:themeColor="text1" w:themeTint="BF"/>
+          <w:szCs w:val="21"/>
+        </w:rPr>
+        <w:t>，支持</w:t>
+      </w:r>
+      <w:r>
+        <w:rPr>
+          <w:rFonts w:ascii="Calibri" w:eastAsia="华文细黑" w:hAnsi="Calibri" w:cs="Calibri" w:hint="eastAsia"/>
+          <w:color w:val="404040" w:themeColor="text1" w:themeTint="BF"/>
+          <w:szCs w:val="21"/>
+        </w:rPr>
+        <w:t>机审、</w:t>
+      </w:r>
+      <w:r>
+        <w:rPr>
+          <w:rFonts w:ascii="Calibri" w:eastAsia="华文细黑" w:hAnsi="Calibri" w:cs="Calibri" w:hint="eastAsia"/>
+          <w:color w:val="404040" w:themeColor="text1" w:themeTint="BF"/>
+          <w:szCs w:val="21"/>
+        </w:rPr>
+        <w:t>人工审核</w:t>
+      </w:r>
+      <w:r>
+        <w:rPr>
+          <w:rFonts w:ascii="Calibri" w:eastAsia="华文细黑" w:hAnsi="Calibri" w:cs="Calibri" w:hint="eastAsia"/>
+          <w:color w:val="404040" w:themeColor="text1" w:themeTint="BF"/>
+          <w:szCs w:val="21"/>
+        </w:rPr>
+        <w:t>、</w:t>
+      </w:r>
+      <w:r>
+        <w:rPr>
+          <w:rFonts w:ascii="Calibri" w:eastAsia="华文细黑" w:hAnsi="Calibri" w:cs="Calibri" w:hint="eastAsia"/>
+          <w:color w:val="404040" w:themeColor="text1" w:themeTint="BF"/>
+          <w:szCs w:val="21"/>
+        </w:rPr>
+        <w:t>红蓝对抗</w:t>
+      </w:r>
+      <w:r>
+        <w:rPr>
+          <w:rFonts w:ascii="Calibri" w:eastAsia="华文细黑" w:hAnsi="Calibri" w:cs="Calibri" w:hint="eastAsia"/>
+          <w:color w:val="404040" w:themeColor="text1" w:themeTint="BF"/>
+          <w:szCs w:val="21"/>
+        </w:rPr>
+        <w:t>、端侧敏感词及</w:t>
+      </w:r>
+      <w:r>
+        <w:rPr>
+          <w:rFonts w:ascii="Calibri" w:eastAsia="华文细黑" w:hAnsi="Calibri" w:cs="Calibri" w:hint="eastAsia"/>
+          <w:color w:val="404040" w:themeColor="text1" w:themeTint="BF"/>
+          <w:szCs w:val="21"/>
+        </w:rPr>
+        <w:t>内容</w:t>
+      </w:r>
+      <w:r>
+        <w:rPr>
+          <w:rFonts w:ascii="Calibri" w:eastAsia="华文细黑" w:hAnsi="Calibri" w:cs="Calibri" w:hint="eastAsia"/>
+          <w:color w:val="404040" w:themeColor="text1" w:themeTint="BF"/>
+          <w:szCs w:val="21"/>
+        </w:rPr>
+        <w:t>风控运营</w:t>
+      </w:r>
+      <w:r>
+        <w:rPr>
+          <w:rFonts w:ascii="Calibri" w:eastAsia="华文细黑" w:hAnsi="Calibri" w:cs="Calibri" w:hint="eastAsia"/>
+          <w:color w:val="404040" w:themeColor="text1" w:themeTint="BF"/>
+          <w:szCs w:val="21"/>
+        </w:rPr>
+        <w:t>，</w:t>
       </w:r>
       <w:r>
         <w:rPr>
@@ -2979,15 +3595,43 @@
           <w:color w:val="404040" w:themeColor="text1" w:themeTint="BF"/>
           <w:szCs w:val="21"/>
         </w:rPr>
-        <w:t>流程</w:t>
-      </w:r>
-      <w:r>
-        <w:rPr>
-          <w:rFonts w:ascii="Calibri" w:eastAsia="华文细黑" w:hAnsi="Calibri" w:cs="Calibri" w:hint="eastAsia"/>
-          <w:color w:val="404040" w:themeColor="text1" w:themeTint="BF"/>
-          <w:szCs w:val="21"/>
-        </w:rPr>
-        <w:t>IT</w:t>
+        <w:t>公司各业务的</w:t>
+      </w:r>
+      <w:r>
+        <w:rPr>
+          <w:rFonts w:ascii="Calibri" w:eastAsia="华文细黑" w:hAnsi="Calibri" w:cs="Calibri" w:hint="eastAsia"/>
+          <w:color w:val="404040" w:themeColor="text1" w:themeTint="BF"/>
+          <w:szCs w:val="21"/>
+        </w:rPr>
+        <w:t>内容安全合规运营提供支撑。</w:t>
+      </w:r>
+    </w:p>
+    <w:p>
+      <w:pPr>
+        <w:spacing w:line="320" w:lineRule="exact"/>
+        <w:rPr>
+          <w:rFonts w:ascii="Calibri" w:eastAsia="华文细黑" w:hAnsi="Calibri" w:cs="Calibri"/>
+          <w:color w:val="404040" w:themeColor="text1" w:themeTint="BF"/>
+          <w:szCs w:val="21"/>
+        </w:rPr>
+      </w:pPr>
+      <w:r>
+        <w:rPr>
+          <w:rFonts w:ascii="Calibri" w:eastAsia="华文细黑" w:hAnsi="Calibri" w:cs="Calibri" w:hint="eastAsia"/>
+          <w:b/>
+          <w:bCs/>
+          <w:color w:val="404040" w:themeColor="text1" w:themeTint="BF"/>
+          <w:szCs w:val="21"/>
+        </w:rPr>
+        <w:t>技术栈：</w:t>
+      </w:r>
+      <w:r>
+        <w:rPr>
+          <w:rFonts w:ascii="Calibri" w:eastAsia="华文细黑" w:hAnsi="Calibri" w:cs="Calibri" w:hint="eastAsia"/>
+          <w:color w:val="404040" w:themeColor="text1" w:themeTint="BF"/>
+          <w:szCs w:val="21"/>
+        </w:rPr>
+        <w:t>springcloud</w:t>
       </w:r>
       <w:r>
         <w:rPr>
@@ -3003,88 +3647,151 @@
           <w:color w:val="404040" w:themeColor="text1" w:themeTint="BF"/>
           <w:szCs w:val="21"/>
         </w:rPr>
-        <w:lastRenderedPageBreak/>
-        <w:t>研发管理部、</w:t>
-      </w:r>
-      <w:r>
-        <w:rPr>
-          <w:rFonts w:ascii="Calibri" w:eastAsia="华文细黑" w:hAnsi="Calibri" w:cs="Calibri" w:hint="eastAsia"/>
-          <w:color w:val="404040" w:themeColor="text1" w:themeTint="BF"/>
-          <w:szCs w:val="21"/>
-        </w:rPr>
-        <w:t>云服务</w:t>
-      </w:r>
-      <w:r>
-        <w:rPr>
-          <w:rFonts w:ascii="Calibri" w:eastAsia="华文细黑" w:hAnsi="Calibri" w:cs="Calibri" w:hint="eastAsia"/>
-          <w:color w:val="404040" w:themeColor="text1" w:themeTint="BF"/>
-          <w:szCs w:val="21"/>
-        </w:rPr>
-        <w:t>部门的荣耀商城、亲选商城、内购商城、运动健康、</w:t>
-      </w:r>
-      <w:r>
-        <w:rPr>
-          <w:rFonts w:ascii="Calibri" w:eastAsia="华文细黑" w:hAnsi="Calibri" w:cs="Calibri" w:hint="eastAsia"/>
-          <w:color w:val="404040" w:themeColor="text1" w:themeTint="BF"/>
-          <w:szCs w:val="21"/>
-        </w:rPr>
-        <w:t>MyHonor</w:t>
-      </w:r>
-      <w:r>
-        <w:rPr>
-          <w:rFonts w:ascii="Calibri" w:eastAsia="华文细黑" w:hAnsi="Calibri" w:cs="Calibri" w:hint="eastAsia"/>
-          <w:color w:val="404040" w:themeColor="text1" w:themeTint="BF"/>
-          <w:szCs w:val="21"/>
-        </w:rPr>
-        <w:t>等</w:t>
-      </w:r>
-      <w:r>
-        <w:rPr>
-          <w:rFonts w:ascii="Calibri" w:eastAsia="华文细黑" w:hAnsi="Calibri" w:cs="Calibri" w:hint="eastAsia"/>
-          <w:color w:val="404040" w:themeColor="text1" w:themeTint="BF"/>
-          <w:szCs w:val="21"/>
-        </w:rPr>
-        <w:t>10+</w:t>
-      </w:r>
-      <w:r>
-        <w:rPr>
-          <w:rFonts w:ascii="Calibri" w:eastAsia="华文细黑" w:hAnsi="Calibri" w:cs="Calibri" w:hint="eastAsia"/>
-          <w:color w:val="404040" w:themeColor="text1" w:themeTint="BF"/>
-          <w:szCs w:val="21"/>
-        </w:rPr>
-        <w:t>业务</w:t>
-      </w:r>
-      <w:r>
-        <w:rPr>
-          <w:rFonts w:ascii="Calibri" w:eastAsia="华文细黑" w:hAnsi="Calibri" w:cs="Calibri" w:hint="eastAsia"/>
-          <w:color w:val="404040" w:themeColor="text1" w:themeTint="BF"/>
-          <w:szCs w:val="21"/>
-        </w:rPr>
-        <w:t>5</w:t>
-      </w:r>
-      <w:r>
-        <w:rPr>
-          <w:rFonts w:ascii="Calibri" w:eastAsia="华文细黑" w:hAnsi="Calibri" w:cs="Calibri" w:hint="eastAsia"/>
-          <w:color w:val="404040" w:themeColor="text1" w:themeTint="BF"/>
-          <w:szCs w:val="21"/>
-        </w:rPr>
-        <w:t>0+</w:t>
-      </w:r>
-      <w:r>
-        <w:rPr>
-          <w:rFonts w:ascii="Calibri" w:eastAsia="华文细黑" w:hAnsi="Calibri" w:cs="Calibri" w:hint="eastAsia"/>
-          <w:color w:val="404040" w:themeColor="text1" w:themeTint="BF"/>
-          <w:szCs w:val="21"/>
-        </w:rPr>
-        <w:t>场景的提供用户风险识别</w:t>
-      </w:r>
-      <w:r>
-        <w:rPr>
-          <w:rFonts w:ascii="Calibri" w:eastAsia="华文细黑" w:hAnsi="Calibri" w:cs="Calibri" w:hint="eastAsia"/>
-          <w:color w:val="404040" w:themeColor="text1" w:themeTint="BF"/>
-          <w:szCs w:val="21"/>
-        </w:rPr>
-        <w:t>能力</w:t>
+        <w:t>springgateway</w:t>
+      </w:r>
+      <w:r>
+        <w:rPr>
+          <w:rFonts w:ascii="Calibri" w:eastAsia="华文细黑" w:hAnsi="Calibri" w:cs="Calibri" w:hint="eastAsia"/>
+          <w:color w:val="404040" w:themeColor="text1" w:themeTint="BF"/>
+          <w:szCs w:val="21"/>
+        </w:rPr>
+        <w:t>、</w:t>
+      </w:r>
+      <w:r>
+        <w:rPr>
+          <w:rFonts w:ascii="Calibri" w:eastAsia="华文细黑" w:hAnsi="Calibri" w:cs="Calibri" w:hint="eastAsia"/>
+          <w:color w:val="404040" w:themeColor="text1" w:themeTint="BF"/>
+          <w:szCs w:val="21"/>
+        </w:rPr>
+        <w:t>nacos</w:t>
+      </w:r>
+      <w:r>
+        <w:rPr>
+          <w:rFonts w:ascii="Calibri" w:eastAsia="华文细黑" w:hAnsi="Calibri" w:cs="Calibri" w:hint="eastAsia"/>
+          <w:color w:val="404040" w:themeColor="text1" w:themeTint="BF"/>
+          <w:szCs w:val="21"/>
+        </w:rPr>
+        <w:t>、</w:t>
+      </w:r>
+      <w:r>
+        <w:rPr>
+          <w:rFonts w:ascii="Calibri" w:eastAsia="华文细黑" w:hAnsi="Calibri" w:cs="Calibri" w:hint="eastAsia"/>
+          <w:color w:val="404040" w:themeColor="text1" w:themeTint="BF"/>
+          <w:szCs w:val="21"/>
+        </w:rPr>
+        <w:t>apollo</w:t>
+      </w:r>
+      <w:r>
+        <w:rPr>
+          <w:rFonts w:ascii="Calibri" w:eastAsia="华文细黑" w:hAnsi="Calibri" w:cs="Calibri" w:hint="eastAsia"/>
+          <w:color w:val="404040" w:themeColor="text1" w:themeTint="BF"/>
+          <w:szCs w:val="21"/>
+        </w:rPr>
+        <w:t>、</w:t>
+      </w:r>
+      <w:r>
+        <w:rPr>
+          <w:rFonts w:ascii="Calibri" w:eastAsia="华文细黑" w:hAnsi="Calibri" w:cs="Calibri" w:hint="eastAsia"/>
+          <w:color w:val="404040" w:themeColor="text1" w:themeTint="BF"/>
+          <w:szCs w:val="21"/>
+        </w:rPr>
+        <w:t>dubbo</w:t>
+      </w:r>
+      <w:r>
+        <w:rPr>
+          <w:rFonts w:ascii="Calibri" w:eastAsia="华文细黑" w:hAnsi="Calibri" w:cs="Calibri" w:hint="eastAsia"/>
+          <w:color w:val="404040" w:themeColor="text1" w:themeTint="BF"/>
+          <w:szCs w:val="21"/>
+        </w:rPr>
+        <w:t>、</w:t>
+      </w:r>
+      <w:r>
+        <w:rPr>
+          <w:rFonts w:ascii="Calibri" w:eastAsia="华文细黑" w:hAnsi="Calibri" w:cs="Calibri" w:hint="eastAsia"/>
+          <w:color w:val="404040" w:themeColor="text1" w:themeTint="BF"/>
+          <w:szCs w:val="21"/>
+        </w:rPr>
+        <w:t>mysql</w:t>
+      </w:r>
+      <w:r>
+        <w:rPr>
+          <w:rFonts w:ascii="Calibri" w:eastAsia="华文细黑" w:hAnsi="Calibri" w:cs="Calibri" w:hint="eastAsia"/>
+          <w:color w:val="404040" w:themeColor="text1" w:themeTint="BF"/>
+          <w:szCs w:val="21"/>
+        </w:rPr>
+        <w:t>、</w:t>
+      </w:r>
+      <w:r>
+        <w:rPr>
+          <w:rFonts w:ascii="Calibri" w:eastAsia="华文细黑" w:hAnsi="Calibri" w:cs="Calibri" w:hint="eastAsia"/>
+          <w:color w:val="404040" w:themeColor="text1" w:themeTint="BF"/>
+          <w:szCs w:val="21"/>
+        </w:rPr>
+        <w:t>elasticsearch</w:t>
+      </w:r>
+      <w:r>
+        <w:rPr>
+          <w:rFonts w:ascii="Calibri" w:eastAsia="华文细黑" w:hAnsi="Calibri" w:cs="Calibri" w:hint="eastAsia"/>
+          <w:color w:val="404040" w:themeColor="text1" w:themeTint="BF"/>
+          <w:szCs w:val="21"/>
+        </w:rPr>
+        <w:t>、</w:t>
+      </w:r>
+      <w:r>
+        <w:rPr>
+          <w:rFonts w:ascii="Calibri" w:eastAsia="华文细黑" w:hAnsi="Calibri" w:cs="Calibri" w:hint="eastAsia"/>
+          <w:color w:val="404040" w:themeColor="text1" w:themeTint="BF"/>
+          <w:szCs w:val="21"/>
+        </w:rPr>
+        <w:t>redis</w:t>
+      </w:r>
+      <w:r>
+        <w:rPr>
+          <w:rFonts w:ascii="Calibri" w:eastAsia="华文细黑" w:hAnsi="Calibri" w:cs="Calibri" w:hint="eastAsia"/>
+          <w:color w:val="404040" w:themeColor="text1" w:themeTint="BF"/>
+          <w:szCs w:val="21"/>
+        </w:rPr>
+        <w:t>、</w:t>
+      </w:r>
+      <w:r>
+        <w:rPr>
+          <w:rFonts w:ascii="Calibri" w:eastAsia="华文细黑" w:hAnsi="Calibri" w:cs="Calibri" w:hint="eastAsia"/>
+          <w:color w:val="404040" w:themeColor="text1" w:themeTint="BF"/>
+          <w:szCs w:val="21"/>
+        </w:rPr>
+        <w:t>kafka</w:t>
+      </w:r>
+    </w:p>
+    <w:p>
+      <w:pPr>
+        <w:spacing w:line="400" w:lineRule="exact"/>
+        <w:rPr>
+          <w:rFonts w:ascii="Calibri" w:eastAsia="华文细黑" w:hAnsi="Calibri" w:cs="Calibri"/>
+          <w:b/>
+          <w:bCs/>
+          <w:color w:val="404040" w:themeColor="text1" w:themeTint="BF"/>
+          <w:szCs w:val="21"/>
+        </w:rPr>
+      </w:pPr>
+      <w:r>
+        <w:rPr>
+          <w:rFonts w:ascii="Calibri" w:eastAsia="华文细黑" w:hAnsi="Calibri" w:cs="Calibri" w:hint="eastAsia"/>
+          <w:b/>
+          <w:bCs/>
+          <w:color w:val="404040" w:themeColor="text1" w:themeTint="BF"/>
+          <w:szCs w:val="21"/>
+        </w:rPr>
+        <w:t>工作职责</w:t>
+      </w:r>
+      <w:r>
+        <w:rPr>
+          <w:rFonts w:ascii="Calibri" w:eastAsia="华文细黑" w:hAnsi="Calibri" w:cs="Calibri" w:hint="eastAsia"/>
+          <w:b/>
+          <w:bCs/>
+          <w:color w:val="404040" w:themeColor="text1" w:themeTint="BF"/>
+          <w:szCs w:val="21"/>
+        </w:rPr>
+        <w:t>：</w:t>
       </w:r>
     </w:p>
     <w:p>
@@ -3092,71 +3799,175 @@
         <w:pStyle w:val="a3"/>
         <w:numPr>
           <w:ilvl w:val="0"/>
-          <w:numId w:val="12"/>
+          <w:numId w:val="21"/>
         </w:numPr>
         <w:spacing w:line="320" w:lineRule="exact"/>
         <w:ind w:left="357" w:firstLineChars="0" w:hanging="357"/>
         <w:rPr>
-          <w:rFonts w:ascii="Calibri" w:eastAsia="华文细黑" w:hAnsi="Calibri" w:cs="Calibri" w:hint="eastAsia"/>
-          <w:color w:val="404040" w:themeColor="text1" w:themeTint="BF"/>
-          <w:szCs w:val="21"/>
-        </w:rPr>
-      </w:pPr>
-      <w:r>
-        <w:rPr>
-          <w:rFonts w:ascii="Calibri" w:eastAsia="华文细黑" w:hAnsi="Calibri" w:cs="Calibri" w:hint="eastAsia"/>
-          <w:color w:val="404040" w:themeColor="text1" w:themeTint="BF"/>
-          <w:szCs w:val="21"/>
-        </w:rPr>
-        <w:t>负责风控需求</w:t>
-      </w:r>
-      <w:r>
-        <w:rPr>
-          <w:rFonts w:ascii="Calibri" w:eastAsia="华文细黑" w:hAnsi="Calibri" w:cs="Calibri" w:hint="eastAsia"/>
-          <w:color w:val="404040" w:themeColor="text1" w:themeTint="BF"/>
-          <w:szCs w:val="21"/>
-        </w:rPr>
-        <w:t>人力</w:t>
-      </w:r>
-      <w:r>
-        <w:rPr>
-          <w:rFonts w:ascii="Calibri" w:eastAsia="华文细黑" w:hAnsi="Calibri" w:cs="Calibri" w:hint="eastAsia"/>
-          <w:color w:val="404040" w:themeColor="text1" w:themeTint="BF"/>
-          <w:szCs w:val="21"/>
-        </w:rPr>
-        <w:t>评估、</w:t>
-      </w:r>
-      <w:r>
-        <w:rPr>
-          <w:rFonts w:ascii="Calibri" w:eastAsia="华文细黑" w:hAnsi="Calibri" w:cs="Calibri" w:hint="eastAsia"/>
-          <w:color w:val="404040" w:themeColor="text1" w:themeTint="BF"/>
-          <w:szCs w:val="21"/>
-        </w:rPr>
-        <w:t>版本</w:t>
-      </w:r>
-      <w:r>
-        <w:rPr>
-          <w:rFonts w:ascii="Calibri" w:eastAsia="华文细黑" w:hAnsi="Calibri" w:cs="Calibri" w:hint="eastAsia"/>
-          <w:color w:val="404040" w:themeColor="text1" w:themeTint="BF"/>
-          <w:szCs w:val="21"/>
-        </w:rPr>
-        <w:t>交付</w:t>
-      </w:r>
-      <w:r>
-        <w:rPr>
-          <w:rFonts w:ascii="Calibri" w:eastAsia="华文细黑" w:hAnsi="Calibri" w:cs="Calibri" w:hint="eastAsia"/>
-          <w:color w:val="404040" w:themeColor="text1" w:themeTint="BF"/>
-          <w:szCs w:val="21"/>
-        </w:rPr>
-        <w:t>、质量管控，</w:t>
-      </w:r>
-      <w:r>
-        <w:rPr>
-          <w:rFonts w:ascii="Calibri" w:eastAsia="华文细黑" w:hAnsi="Calibri" w:cs="Calibri" w:hint="eastAsia"/>
-          <w:color w:val="404040" w:themeColor="text1" w:themeTint="BF"/>
-          <w:szCs w:val="21"/>
-        </w:rPr>
-        <w:t>对风险及时识别</w:t>
+          <w:rFonts w:ascii="Calibri" w:eastAsia="华文细黑" w:hAnsi="Calibri" w:cs="Calibri"/>
+          <w:color w:val="404040" w:themeColor="text1" w:themeTint="BF"/>
+          <w:szCs w:val="21"/>
+        </w:rPr>
+      </w:pPr>
+      <w:r>
+        <w:rPr>
+          <w:rFonts w:ascii="Calibri" w:eastAsia="华文细黑" w:hAnsi="Calibri" w:cs="Calibri" w:hint="eastAsia"/>
+          <w:color w:val="404040" w:themeColor="text1" w:themeTint="BF"/>
+          <w:szCs w:val="21"/>
+        </w:rPr>
+        <w:t>负责</w:t>
+      </w:r>
+      <w:r>
+        <w:rPr>
+          <w:rFonts w:ascii="Calibri" w:eastAsia="华文细黑" w:hAnsi="Calibri" w:cs="Calibri" w:hint="eastAsia"/>
+          <w:color w:val="404040" w:themeColor="text1" w:themeTint="BF"/>
+          <w:szCs w:val="21"/>
+        </w:rPr>
+        <w:t>整体应用</w:t>
+      </w:r>
+      <w:r>
+        <w:rPr>
+          <w:rFonts w:ascii="Calibri" w:eastAsia="华文细黑" w:hAnsi="Calibri" w:cs="Calibri" w:hint="eastAsia"/>
+          <w:color w:val="404040" w:themeColor="text1" w:themeTint="BF"/>
+          <w:szCs w:val="21"/>
+        </w:rPr>
+        <w:t>架构</w:t>
+      </w:r>
+      <w:r>
+        <w:rPr>
+          <w:rFonts w:ascii="Calibri" w:eastAsia="华文细黑" w:hAnsi="Calibri" w:cs="Calibri" w:hint="eastAsia"/>
+          <w:color w:val="404040" w:themeColor="text1" w:themeTint="BF"/>
+          <w:szCs w:val="21"/>
+        </w:rPr>
+        <w:t>和解决</w:t>
+      </w:r>
+      <w:r>
+        <w:rPr>
+          <w:rFonts w:ascii="Calibri" w:eastAsia="华文细黑" w:hAnsi="Calibri" w:cs="Calibri" w:hint="eastAsia"/>
+          <w:color w:val="404040" w:themeColor="text1" w:themeTint="BF"/>
+          <w:szCs w:val="21"/>
+        </w:rPr>
+        <w:t>方案设计</w:t>
+      </w:r>
+      <w:r>
+        <w:rPr>
+          <w:rFonts w:ascii="Calibri" w:eastAsia="华文细黑" w:hAnsi="Calibri" w:cs="Calibri" w:hint="eastAsia"/>
+          <w:color w:val="404040" w:themeColor="text1" w:themeTint="BF"/>
+          <w:szCs w:val="21"/>
+        </w:rPr>
+        <w:t>，</w:t>
+      </w:r>
+      <w:r>
+        <w:rPr>
+          <w:rFonts w:ascii="Calibri" w:eastAsia="华文细黑" w:hAnsi="Calibri" w:cs="Calibri"/>
+          <w:color w:val="404040" w:themeColor="text1" w:themeTint="BF"/>
+          <w:szCs w:val="21"/>
+        </w:rPr>
+        <w:t>基于</w:t>
+      </w:r>
+      <w:r>
+        <w:rPr>
+          <w:rFonts w:ascii="Calibri" w:eastAsia="华文细黑" w:hAnsi="Calibri" w:cs="Calibri"/>
+          <w:color w:val="404040" w:themeColor="text1" w:themeTint="BF"/>
+          <w:szCs w:val="21"/>
+        </w:rPr>
+        <w:t xml:space="preserve"> SpringCloud </w:t>
+      </w:r>
+      <w:r>
+        <w:rPr>
+          <w:rFonts w:ascii="Calibri" w:eastAsia="华文细黑" w:hAnsi="Calibri" w:cs="Calibri"/>
+          <w:color w:val="404040" w:themeColor="text1" w:themeTint="BF"/>
+          <w:szCs w:val="21"/>
+        </w:rPr>
+        <w:t>体系完成微服务拆分、部署架构规划、</w:t>
+      </w:r>
+      <w:r>
+        <w:rPr>
+          <w:rFonts w:ascii="Calibri" w:eastAsia="华文细黑" w:hAnsi="Calibri" w:cs="Calibri" w:hint="eastAsia"/>
+          <w:color w:val="404040" w:themeColor="text1" w:themeTint="BF"/>
+          <w:szCs w:val="21"/>
+        </w:rPr>
+        <w:t>概要设计</w:t>
+      </w:r>
+      <w:r>
+        <w:rPr>
+          <w:rFonts w:ascii="Calibri" w:eastAsia="华文细黑" w:hAnsi="Calibri" w:cs="Calibri" w:hint="eastAsia"/>
+          <w:color w:val="404040" w:themeColor="text1" w:themeTint="BF"/>
+          <w:szCs w:val="21"/>
+        </w:rPr>
+        <w:t>以及</w:t>
+      </w:r>
+      <w:r>
+        <w:rPr>
+          <w:rFonts w:ascii="Calibri" w:eastAsia="华文细黑" w:hAnsi="Calibri" w:cs="Calibri" w:hint="eastAsia"/>
+          <w:color w:val="404040" w:themeColor="text1" w:themeTint="BF"/>
+          <w:szCs w:val="21"/>
+        </w:rPr>
+        <w:t>DFX</w:t>
+      </w:r>
+      <w:r>
+        <w:rPr>
+          <w:rFonts w:ascii="Calibri" w:eastAsia="华文细黑" w:hAnsi="Calibri" w:cs="Calibri" w:hint="eastAsia"/>
+          <w:color w:val="404040" w:themeColor="text1" w:themeTint="BF"/>
+          <w:szCs w:val="21"/>
+        </w:rPr>
+        <w:t>相关设计</w:t>
+      </w:r>
+      <w:r>
+        <w:rPr>
+          <w:rFonts w:ascii="Calibri" w:eastAsia="华文细黑" w:hAnsi="Calibri" w:cs="Calibri" w:hint="eastAsia"/>
+          <w:color w:val="404040" w:themeColor="text1" w:themeTint="BF"/>
+          <w:szCs w:val="21"/>
+        </w:rPr>
+        <w:t>（</w:t>
+      </w:r>
+      <w:r>
+        <w:rPr>
+          <w:rFonts w:ascii="Calibri" w:eastAsia="华文细黑" w:hAnsi="Calibri" w:cs="Calibri"/>
+          <w:color w:val="404040" w:themeColor="text1" w:themeTint="BF"/>
+          <w:szCs w:val="21"/>
+        </w:rPr>
+        <w:t>可靠性、可用性、可扩展性、可观测性、安全性等</w:t>
+      </w:r>
+      <w:r>
+        <w:rPr>
+          <w:rFonts w:ascii="Calibri" w:eastAsia="华文细黑" w:hAnsi="Calibri" w:cs="Calibri" w:hint="eastAsia"/>
+          <w:color w:val="404040" w:themeColor="text1" w:themeTint="BF"/>
+          <w:szCs w:val="21"/>
+        </w:rPr>
+        <w:t>）</w:t>
+      </w:r>
+      <w:r>
+        <w:rPr>
+          <w:rFonts w:ascii="Calibri" w:eastAsia="华文细黑" w:hAnsi="Calibri" w:cs="Calibri" w:hint="eastAsia"/>
+          <w:color w:val="404040" w:themeColor="text1" w:themeTint="BF"/>
+          <w:szCs w:val="21"/>
+        </w:rPr>
+        <w:t>，</w:t>
+      </w:r>
+      <w:r>
+        <w:rPr>
+          <w:rFonts w:ascii="Calibri" w:eastAsia="华文细黑" w:hAnsi="Calibri" w:cs="Calibri" w:hint="eastAsia"/>
+          <w:color w:val="404040" w:themeColor="text1" w:themeTint="BF"/>
+          <w:szCs w:val="21"/>
+        </w:rPr>
+        <w:t>保障</w:t>
+      </w:r>
+      <w:r>
+        <w:rPr>
+          <w:rFonts w:ascii="Calibri" w:eastAsia="华文细黑" w:hAnsi="Calibri" w:cs="Calibri" w:hint="eastAsia"/>
+          <w:color w:val="404040" w:themeColor="text1" w:themeTint="BF"/>
+          <w:szCs w:val="21"/>
+        </w:rPr>
+        <w:t>应用</w:t>
+      </w:r>
+      <w:r>
+        <w:rPr>
+          <w:rFonts w:ascii="Calibri" w:eastAsia="华文细黑" w:hAnsi="Calibri" w:cs="Calibri" w:hint="eastAsia"/>
+          <w:color w:val="404040" w:themeColor="text1" w:themeTint="BF"/>
+          <w:szCs w:val="21"/>
+        </w:rPr>
+        <w:t>高可用、高性能、高并发</w:t>
       </w:r>
       <w:r>
         <w:rPr>
@@ -3172,100 +3983,1075 @@
           <w:color w:val="404040" w:themeColor="text1" w:themeTint="BF"/>
           <w:szCs w:val="21"/>
         </w:rPr>
-        <w:t>预警</w:t>
-      </w:r>
-      <w:r>
-        <w:rPr>
-          <w:rFonts w:ascii="Calibri" w:eastAsia="华文细黑" w:hAnsi="Calibri" w:cs="Calibri" w:hint="eastAsia"/>
-          <w:color w:val="404040" w:themeColor="text1" w:themeTint="BF"/>
-          <w:szCs w:val="21"/>
-        </w:rPr>
-        <w:t>及处理，保障</w:t>
-      </w:r>
-      <w:r>
-        <w:rPr>
-          <w:rFonts w:ascii="Calibri" w:eastAsia="华文细黑" w:hAnsi="Calibri" w:cs="Calibri" w:hint="eastAsia"/>
-          <w:color w:val="404040" w:themeColor="text1" w:themeTint="BF"/>
-          <w:szCs w:val="21"/>
-        </w:rPr>
-        <w:t>版本按时高质量交付</w:t>
-      </w:r>
-      <w:r>
-        <w:rPr>
-          <w:rFonts w:ascii="Calibri" w:eastAsia="华文细黑" w:hAnsi="Calibri" w:cs="Calibri" w:hint="eastAsia"/>
-          <w:color w:val="404040" w:themeColor="text1" w:themeTint="BF"/>
-          <w:szCs w:val="21"/>
-        </w:rPr>
-        <w:t>，</w:t>
-      </w:r>
-      <w:r>
-        <w:rPr>
-          <w:rFonts w:ascii="Calibri" w:eastAsia="华文细黑" w:hAnsi="Calibri" w:cs="Calibri" w:hint="eastAsia"/>
-          <w:color w:val="404040" w:themeColor="text1" w:themeTint="BF"/>
-          <w:szCs w:val="21"/>
-        </w:rPr>
-        <w:t>代码质量不高于</w:t>
-      </w:r>
-      <w:r>
-        <w:rPr>
-          <w:rFonts w:ascii="Calibri" w:eastAsia="华文细黑" w:hAnsi="Calibri" w:cs="Calibri" w:hint="eastAsia"/>
-          <w:color w:val="404040" w:themeColor="text1" w:themeTint="BF"/>
-          <w:szCs w:val="21"/>
-        </w:rPr>
-        <w:t>L2</w:t>
-      </w:r>
-      <w:r>
-        <w:rPr>
-          <w:rFonts w:ascii="Calibri" w:eastAsia="华文细黑" w:hAnsi="Calibri" w:cs="Calibri" w:hint="eastAsia"/>
-          <w:color w:val="404040" w:themeColor="text1" w:themeTint="BF"/>
-          <w:szCs w:val="21"/>
-        </w:rPr>
-        <w:t>，</w:t>
-      </w:r>
-      <w:r>
-        <w:rPr>
-          <w:rFonts w:ascii="Calibri" w:eastAsia="华文细黑" w:hAnsi="Calibri" w:cs="Calibri" w:hint="eastAsia"/>
-          <w:color w:val="404040" w:themeColor="text1" w:themeTint="BF"/>
-          <w:szCs w:val="21"/>
-        </w:rPr>
-        <w:t>研发缺陷密度不高于</w:t>
-      </w:r>
-      <w:r>
-        <w:rPr>
-          <w:rFonts w:ascii="Calibri" w:eastAsia="华文细黑" w:hAnsi="Calibri" w:cs="Calibri" w:hint="eastAsia"/>
-          <w:color w:val="404040" w:themeColor="text1" w:themeTint="BF"/>
-          <w:szCs w:val="21"/>
-        </w:rPr>
-        <w:t>3</w:t>
-      </w:r>
-      <w:r>
-        <w:rPr>
-          <w:rFonts w:ascii="Calibri" w:eastAsia="华文细黑" w:hAnsi="Calibri" w:cs="Calibri" w:hint="eastAsia"/>
-          <w:color w:val="404040" w:themeColor="text1" w:themeTint="BF"/>
-          <w:szCs w:val="21"/>
-        </w:rPr>
-        <w:t>，</w:t>
-      </w:r>
-      <w:r>
-        <w:rPr>
-          <w:rFonts w:ascii="Calibri" w:eastAsia="华文细黑" w:hAnsi="Calibri" w:cs="Calibri" w:hint="eastAsia"/>
-          <w:color w:val="404040" w:themeColor="text1" w:themeTint="BF"/>
-          <w:szCs w:val="21"/>
-        </w:rPr>
-        <w:t>多次上月度红榜。</w:t>
-      </w:r>
-      <w:r>
-        <w:rPr>
-          <w:rFonts w:ascii="Calibri" w:eastAsia="华文细黑" w:hAnsi="Calibri" w:cs="Calibri" w:hint="eastAsia"/>
-          <w:color w:val="404040" w:themeColor="text1" w:themeTint="BF"/>
-          <w:szCs w:val="21"/>
-        </w:rPr>
-        <w:t>个人多次被评选为月度之星</w:t>
+        <w:t>可扩展</w:t>
+      </w:r>
+      <w:r>
+        <w:rPr>
+          <w:rFonts w:ascii="Calibri" w:eastAsia="华文细黑" w:hAnsi="Calibri" w:cs="Calibri" w:hint="eastAsia"/>
+          <w:color w:val="404040" w:themeColor="text1" w:themeTint="BF"/>
+          <w:szCs w:val="21"/>
+        </w:rPr>
+        <w:t>以及</w:t>
+      </w:r>
+      <w:r>
+        <w:rPr>
+          <w:rFonts w:ascii="Calibri" w:eastAsia="华文细黑" w:hAnsi="Calibri" w:cs="Calibri" w:hint="eastAsia"/>
+          <w:color w:val="404040" w:themeColor="text1" w:themeTint="BF"/>
+          <w:szCs w:val="21"/>
+        </w:rPr>
+        <w:t>安全性</w:t>
       </w:r>
     </w:p>
     <w:p>
       <w:pPr>
+        <w:pStyle w:val="a3"/>
+        <w:numPr>
+          <w:ilvl w:val="0"/>
+          <w:numId w:val="21"/>
+        </w:numPr>
+        <w:ind w:firstLineChars="0"/>
+        <w:rPr>
+          <w:rFonts w:ascii="Calibri" w:eastAsia="华文细黑" w:hAnsi="Calibri" w:cs="Calibri"/>
+          <w:color w:val="404040" w:themeColor="text1" w:themeTint="BF"/>
+          <w:szCs w:val="21"/>
+        </w:rPr>
+      </w:pPr>
+      <w:r>
+        <w:rPr>
+          <w:rFonts w:ascii="Calibri" w:eastAsia="华文细黑" w:hAnsi="Calibri" w:cs="Calibri" w:hint="eastAsia"/>
+          <w:color w:val="404040" w:themeColor="text1" w:themeTint="BF"/>
+          <w:szCs w:val="21"/>
+        </w:rPr>
+        <w:t>承担项目核心模块代码</w:t>
+      </w:r>
+      <w:r>
+        <w:rPr>
+          <w:rFonts w:ascii="Calibri" w:eastAsia="华文细黑" w:hAnsi="Calibri" w:cs="Calibri" w:hint="eastAsia"/>
+          <w:color w:val="404040" w:themeColor="text1" w:themeTint="BF"/>
+          <w:szCs w:val="21"/>
+        </w:rPr>
+        <w:t>（如中控服务、</w:t>
+      </w:r>
+      <w:r>
+        <w:rPr>
+          <w:rFonts w:ascii="Calibri" w:eastAsia="华文细黑" w:hAnsi="Calibri" w:cs="Calibri"/>
+          <w:color w:val="404040" w:themeColor="text1" w:themeTint="BF"/>
+          <w:szCs w:val="21"/>
+        </w:rPr>
+        <w:t>网关路由、规则引擎联动</w:t>
+      </w:r>
+      <w:r>
+        <w:rPr>
+          <w:rFonts w:ascii="Calibri" w:eastAsia="华文细黑" w:hAnsi="Calibri" w:cs="Calibri" w:hint="eastAsia"/>
+          <w:color w:val="404040" w:themeColor="text1" w:themeTint="BF"/>
+          <w:szCs w:val="21"/>
+        </w:rPr>
+        <w:t>、抽样人审</w:t>
+      </w:r>
+      <w:r>
+        <w:rPr>
+          <w:rFonts w:ascii="Calibri" w:eastAsia="华文细黑" w:hAnsi="Calibri" w:cs="Calibri"/>
+          <w:color w:val="404040" w:themeColor="text1" w:themeTint="BF"/>
+          <w:szCs w:val="21"/>
+        </w:rPr>
+        <w:t>等</w:t>
+      </w:r>
+      <w:r>
+        <w:rPr>
+          <w:rFonts w:ascii="Calibri" w:eastAsia="华文细黑" w:hAnsi="Calibri" w:cs="Calibri" w:hint="eastAsia"/>
+          <w:color w:val="404040" w:themeColor="text1" w:themeTint="BF"/>
+          <w:szCs w:val="21"/>
+        </w:rPr>
+        <w:t>）</w:t>
+      </w:r>
+      <w:r>
+        <w:rPr>
+          <w:rFonts w:ascii="Calibri" w:eastAsia="华文细黑" w:hAnsi="Calibri" w:cs="Calibri" w:hint="eastAsia"/>
+          <w:color w:val="404040" w:themeColor="text1" w:themeTint="BF"/>
+          <w:szCs w:val="21"/>
+        </w:rPr>
+        <w:t>开发工作，</w:t>
+      </w:r>
+      <w:r>
+        <w:rPr>
+          <w:rFonts w:ascii="Calibri" w:eastAsia="华文细黑" w:hAnsi="Calibri" w:cs="Calibri" w:hint="eastAsia"/>
+          <w:color w:val="404040" w:themeColor="text1" w:themeTint="BF"/>
+          <w:szCs w:val="21"/>
+        </w:rPr>
+        <w:t>包括</w:t>
+      </w:r>
+      <w:r>
+        <w:rPr>
+          <w:rFonts w:ascii="Calibri" w:eastAsia="华文细黑" w:hAnsi="Calibri" w:cs="Calibri" w:hint="eastAsia"/>
+          <w:color w:val="404040" w:themeColor="text1" w:themeTint="BF"/>
+          <w:szCs w:val="21"/>
+        </w:rPr>
+        <w:t>关键功能的编码、</w:t>
+      </w:r>
+      <w:r>
+        <w:rPr>
+          <w:rFonts w:ascii="Calibri" w:eastAsia="华文细黑" w:hAnsi="Calibri" w:cs="Calibri" w:hint="eastAsia"/>
+          <w:color w:val="404040" w:themeColor="text1" w:themeTint="BF"/>
+          <w:szCs w:val="21"/>
+        </w:rPr>
+        <w:t>联调</w:t>
+      </w:r>
+      <w:r>
+        <w:rPr>
+          <w:rFonts w:ascii="Calibri" w:eastAsia="华文细黑" w:hAnsi="Calibri" w:cs="Calibri" w:hint="eastAsia"/>
+          <w:color w:val="404040" w:themeColor="text1" w:themeTint="BF"/>
+          <w:szCs w:val="21"/>
+        </w:rPr>
+        <w:t>与优化，解决开发过程中的技术难点与瓶颈，确保核心服务稳定运行</w:t>
+      </w:r>
+    </w:p>
+    <w:p>
+      <w:pPr>
+        <w:pStyle w:val="a3"/>
+        <w:numPr>
+          <w:ilvl w:val="0"/>
+          <w:numId w:val="21"/>
+        </w:numPr>
+        <w:spacing w:line="320" w:lineRule="exact"/>
+        <w:ind w:left="357" w:firstLineChars="0" w:hanging="357"/>
+        <w:rPr>
+          <w:rFonts w:ascii="Calibri" w:eastAsia="华文细黑" w:hAnsi="Calibri" w:cs="Calibri"/>
+          <w:color w:val="404040" w:themeColor="text1" w:themeTint="BF"/>
+          <w:szCs w:val="21"/>
+        </w:rPr>
+      </w:pPr>
+      <w:r>
+        <w:rPr>
+          <w:rFonts w:ascii="Calibri" w:eastAsia="华文细黑" w:hAnsi="Calibri" w:cs="Calibri" w:hint="eastAsia"/>
+          <w:color w:val="404040" w:themeColor="text1" w:themeTint="BF"/>
+          <w:szCs w:val="21"/>
+        </w:rPr>
+        <w:t>负责版本的</w:t>
+      </w:r>
+      <w:r>
+        <w:rPr>
+          <w:rFonts w:ascii="Calibri" w:eastAsia="华文细黑" w:hAnsi="Calibri" w:cs="Calibri" w:hint="eastAsia"/>
+          <w:color w:val="404040" w:themeColor="text1" w:themeTint="BF"/>
+          <w:szCs w:val="21"/>
+        </w:rPr>
+        <w:t>需求评估、版本</w:t>
+      </w:r>
+      <w:r>
+        <w:rPr>
+          <w:rFonts w:ascii="Calibri" w:eastAsia="华文细黑" w:hAnsi="Calibri" w:cs="Calibri" w:hint="eastAsia"/>
+          <w:color w:val="404040" w:themeColor="text1" w:themeTint="BF"/>
+          <w:szCs w:val="21"/>
+        </w:rPr>
+        <w:t>交付</w:t>
+      </w:r>
+      <w:r>
+        <w:rPr>
+          <w:rFonts w:ascii="Calibri" w:eastAsia="华文细黑" w:hAnsi="Calibri" w:cs="Calibri" w:hint="eastAsia"/>
+          <w:color w:val="404040" w:themeColor="text1" w:themeTint="BF"/>
+          <w:szCs w:val="21"/>
+        </w:rPr>
+        <w:t>，组织团队成员</w:t>
+      </w:r>
+      <w:r>
+        <w:rPr>
+          <w:rFonts w:ascii="Calibri" w:eastAsia="华文细黑" w:hAnsi="Calibri" w:cs="Calibri" w:hint="eastAsia"/>
+          <w:color w:val="404040" w:themeColor="text1" w:themeTint="BF"/>
+          <w:szCs w:val="21"/>
+        </w:rPr>
+        <w:t>开展</w:t>
+      </w:r>
+      <w:r>
+        <w:rPr>
+          <w:rFonts w:ascii="Calibri" w:eastAsia="华文细黑" w:hAnsi="Calibri" w:cs="Calibri" w:hint="eastAsia"/>
+          <w:color w:val="404040" w:themeColor="text1" w:themeTint="BF"/>
+          <w:szCs w:val="21"/>
+        </w:rPr>
+        <w:t>设计方案反</w:t>
+      </w:r>
+      <w:r>
+        <w:rPr>
+          <w:rFonts w:ascii="Calibri" w:eastAsia="华文细黑" w:hAnsi="Calibri" w:cs="Calibri" w:hint="eastAsia"/>
+          <w:color w:val="404040" w:themeColor="text1" w:themeTint="BF"/>
+          <w:szCs w:val="21"/>
+        </w:rPr>
+        <w:t>串讲、代码评审、转测归档评审</w:t>
+      </w:r>
+      <w:r>
+        <w:rPr>
+          <w:rFonts w:ascii="Calibri" w:eastAsia="华文细黑" w:hAnsi="Calibri" w:cs="Calibri" w:hint="eastAsia"/>
+          <w:color w:val="404040" w:themeColor="text1" w:themeTint="BF"/>
+          <w:szCs w:val="21"/>
+        </w:rPr>
+        <w:t>以及</w:t>
+      </w:r>
+      <w:r>
+        <w:rPr>
+          <w:rFonts w:ascii="Calibri" w:eastAsia="华文细黑" w:hAnsi="Calibri" w:cs="Calibri" w:hint="eastAsia"/>
+          <w:color w:val="404040" w:themeColor="text1" w:themeTint="BF"/>
+          <w:szCs w:val="21"/>
+        </w:rPr>
+        <w:t>版本问题回溯，</w:t>
+      </w:r>
+      <w:r>
+        <w:rPr>
+          <w:rFonts w:ascii="Calibri" w:eastAsia="华文细黑" w:hAnsi="Calibri" w:cs="Calibri" w:hint="eastAsia"/>
+          <w:color w:val="404040" w:themeColor="text1" w:themeTint="BF"/>
+          <w:szCs w:val="21"/>
+        </w:rPr>
+        <w:t>对版本过程中的风险及时识别、预警以及处理</w:t>
+      </w:r>
+      <w:r>
+        <w:rPr>
+          <w:rFonts w:ascii="Calibri" w:eastAsia="华文细黑" w:hAnsi="Calibri" w:cs="Calibri" w:hint="eastAsia"/>
+          <w:color w:val="404040" w:themeColor="text1" w:themeTint="BF"/>
+          <w:szCs w:val="21"/>
+        </w:rPr>
+        <w:t>，保障版本高质量交付</w:t>
+      </w:r>
+    </w:p>
+    <w:p>
+      <w:pPr>
+        <w:pStyle w:val="a3"/>
+        <w:numPr>
+          <w:ilvl w:val="0"/>
+          <w:numId w:val="21"/>
+        </w:numPr>
+        <w:spacing w:line="320" w:lineRule="exact"/>
+        <w:ind w:left="357" w:firstLineChars="0" w:hanging="357"/>
+        <w:rPr>
+          <w:rFonts w:ascii="Calibri" w:eastAsia="华文细黑" w:hAnsi="Calibri" w:cs="Calibri"/>
+          <w:color w:val="404040" w:themeColor="text1" w:themeTint="BF"/>
+          <w:szCs w:val="21"/>
+        </w:rPr>
+      </w:pPr>
+      <w:r>
+        <w:rPr>
+          <w:rFonts w:ascii="Calibri" w:eastAsia="华文细黑" w:hAnsi="Calibri" w:cs="Calibri" w:hint="eastAsia"/>
+          <w:color w:val="404040" w:themeColor="text1" w:themeTint="BF"/>
+          <w:szCs w:val="21"/>
+        </w:rPr>
+        <w:t>编写业务接入手册、运营使用文档及接口规范文档，规范接入流程与操作标准，支撑业务快速接入与日常运营</w:t>
+      </w:r>
+    </w:p>
+    <w:p>
+      <w:pPr>
+        <w:spacing w:line="320" w:lineRule="exact"/>
+        <w:rPr>
+          <w:rFonts w:ascii="Calibri" w:eastAsia="华文细黑" w:hAnsi="Calibri" w:cs="Calibri"/>
+          <w:b/>
+          <w:bCs/>
+          <w:color w:val="404040" w:themeColor="text1" w:themeTint="BF"/>
+          <w:szCs w:val="21"/>
+        </w:rPr>
+      </w:pPr>
+    </w:p>
+    <w:p>
+      <w:pPr>
+        <w:spacing w:line="320" w:lineRule="exact"/>
+        <w:rPr>
+          <w:rFonts w:ascii="Calibri" w:eastAsia="华文细黑" w:hAnsi="Calibri" w:cs="Calibri"/>
+          <w:b/>
+          <w:bCs/>
+          <w:color w:val="404040" w:themeColor="text1" w:themeTint="BF"/>
+          <w:szCs w:val="21"/>
+        </w:rPr>
+      </w:pPr>
+      <w:r>
+        <w:rPr>
+          <w:rFonts w:ascii="Calibri" w:eastAsia="华文细黑" w:hAnsi="Calibri" w:cs="Calibri" w:hint="eastAsia"/>
+          <w:b/>
+          <w:bCs/>
+          <w:color w:val="404040" w:themeColor="text1" w:themeTint="BF"/>
+          <w:szCs w:val="21"/>
+        </w:rPr>
+        <w:t>项目</w:t>
+      </w:r>
+      <w:r>
+        <w:rPr>
+          <w:rFonts w:ascii="Calibri" w:eastAsia="华文细黑" w:hAnsi="Calibri" w:cs="Calibri" w:hint="eastAsia"/>
+          <w:b/>
+          <w:bCs/>
+          <w:color w:val="404040" w:themeColor="text1" w:themeTint="BF"/>
+          <w:szCs w:val="21"/>
+        </w:rPr>
+        <w:t>二：</w:t>
+      </w:r>
+      <w:r>
+        <w:rPr>
+          <w:rFonts w:ascii="Calibri" w:eastAsia="华文细黑" w:hAnsi="Calibri" w:cs="Calibri" w:hint="eastAsia"/>
+          <w:b/>
+          <w:bCs/>
+          <w:color w:val="404040" w:themeColor="text1" w:themeTint="BF"/>
+          <w:szCs w:val="21"/>
+        </w:rPr>
+        <w:t>交易风控能力建设</w:t>
+      </w:r>
+    </w:p>
+    <w:p>
+      <w:pPr>
+        <w:spacing w:line="320" w:lineRule="exact"/>
+        <w:rPr>
+          <w:rFonts w:ascii="Calibri" w:eastAsia="华文细黑" w:hAnsi="Calibri" w:cs="Calibri"/>
+          <w:b/>
+          <w:bCs/>
+          <w:color w:val="404040" w:themeColor="text1" w:themeTint="BF"/>
+          <w:szCs w:val="21"/>
+        </w:rPr>
+      </w:pPr>
+      <w:r>
+        <w:rPr>
+          <w:rFonts w:ascii="Calibri" w:eastAsia="华文细黑" w:hAnsi="Calibri" w:cs="Calibri" w:hint="eastAsia"/>
+          <w:b/>
+          <w:bCs/>
+          <w:color w:val="404040" w:themeColor="text1" w:themeTint="BF"/>
+          <w:szCs w:val="21"/>
+        </w:rPr>
+        <w:t>项目介绍：</w:t>
+      </w:r>
+    </w:p>
+    <w:p>
+      <w:pPr>
+        <w:spacing w:line="320" w:lineRule="exact"/>
+        <w:rPr>
+          <w:rFonts w:ascii="Calibri" w:eastAsia="华文细黑" w:hAnsi="Calibri" w:cs="Calibri"/>
+          <w:color w:val="404040" w:themeColor="text1" w:themeTint="BF"/>
+          <w:szCs w:val="21"/>
+        </w:rPr>
+      </w:pPr>
+      <w:r>
+        <w:rPr>
+          <w:rFonts w:ascii="Calibri" w:eastAsia="华文细黑" w:hAnsi="Calibri" w:cs="Calibri"/>
+          <w:b/>
+          <w:bCs/>
+          <w:color w:val="404040" w:themeColor="text1" w:themeTint="BF"/>
+          <w:szCs w:val="21"/>
+        </w:rPr>
+        <w:tab/>
+      </w:r>
+      <w:r>
+        <w:rPr>
+          <w:rFonts w:ascii="Calibri" w:eastAsia="华文细黑" w:hAnsi="Calibri" w:cs="Calibri" w:hint="eastAsia"/>
+          <w:color w:val="404040" w:themeColor="text1" w:themeTint="BF"/>
+          <w:szCs w:val="21"/>
+        </w:rPr>
+        <w:t>交易风控是电商系统中用于识别、拦截和处置异常交易与恶意行为的系统，</w:t>
+      </w:r>
+      <w:r>
+        <w:rPr>
+          <w:rFonts w:ascii="Calibri" w:eastAsia="华文细黑" w:hAnsi="Calibri" w:cs="Calibri" w:hint="eastAsia"/>
+          <w:color w:val="404040" w:themeColor="text1" w:themeTint="BF"/>
+          <w:szCs w:val="21"/>
+        </w:rPr>
+        <w:t>在商城订单和运营活动时，比如下单、抢购、领券、参与活动等，识别用户行为是否有风险及风险等级和类型，执行防控策略，比如图像验证、短信验证或者拒绝用户请求</w:t>
+      </w:r>
+      <w:r>
+        <w:rPr>
+          <w:rFonts w:ascii="Calibri" w:eastAsia="华文细黑" w:hAnsi="Calibri" w:cs="Calibri" w:hint="eastAsia"/>
+          <w:color w:val="404040" w:themeColor="text1" w:themeTint="BF"/>
+          <w:szCs w:val="21"/>
+        </w:rPr>
+        <w:t>。</w:t>
+      </w:r>
+    </w:p>
+    <w:p>
+      <w:pPr>
+        <w:spacing w:line="320" w:lineRule="exact"/>
+        <w:rPr>
+          <w:rFonts w:ascii="Calibri" w:eastAsia="华文细黑" w:hAnsi="Calibri" w:cs="Calibri"/>
+          <w:color w:val="404040" w:themeColor="text1" w:themeTint="BF"/>
+          <w:szCs w:val="21"/>
+        </w:rPr>
+      </w:pPr>
+      <w:r>
+        <w:rPr>
+          <w:rFonts w:ascii="Calibri" w:eastAsia="华文细黑" w:hAnsi="Calibri" w:cs="Calibri" w:hint="eastAsia"/>
+          <w:b/>
+          <w:bCs/>
+          <w:color w:val="404040" w:themeColor="text1" w:themeTint="BF"/>
+          <w:szCs w:val="21"/>
+        </w:rPr>
+        <w:t>技术栈：</w:t>
+      </w:r>
+      <w:r>
+        <w:rPr>
+          <w:rFonts w:ascii="Calibri" w:eastAsia="华文细黑" w:hAnsi="Calibri" w:cs="Calibri" w:hint="eastAsia"/>
+          <w:color w:val="404040" w:themeColor="text1" w:themeTint="BF"/>
+          <w:szCs w:val="21"/>
+        </w:rPr>
+        <w:t>spring</w:t>
+      </w:r>
+      <w:r>
+        <w:rPr>
+          <w:rFonts w:ascii="Calibri" w:eastAsia="华文细黑" w:hAnsi="Calibri" w:cs="Calibri" w:hint="eastAsia"/>
+          <w:color w:val="404040" w:themeColor="text1" w:themeTint="BF"/>
+          <w:szCs w:val="21"/>
+        </w:rPr>
+        <w:t>boot</w:t>
+      </w:r>
+      <w:r>
+        <w:rPr>
+          <w:rFonts w:ascii="Calibri" w:eastAsia="华文细黑" w:hAnsi="Calibri" w:cs="Calibri" w:hint="eastAsia"/>
+          <w:color w:val="404040" w:themeColor="text1" w:themeTint="BF"/>
+          <w:szCs w:val="21"/>
+        </w:rPr>
+        <w:t>、</w:t>
+      </w:r>
+      <w:r>
+        <w:rPr>
+          <w:rFonts w:ascii="Calibri" w:eastAsia="华文细黑" w:hAnsi="Calibri" w:cs="Calibri" w:hint="eastAsia"/>
+          <w:color w:val="404040" w:themeColor="text1" w:themeTint="BF"/>
+          <w:szCs w:val="21"/>
+        </w:rPr>
+        <w:t>dubbo</w:t>
+      </w:r>
+      <w:r>
+        <w:rPr>
+          <w:rFonts w:ascii="Calibri" w:eastAsia="华文细黑" w:hAnsi="Calibri" w:cs="Calibri" w:hint="eastAsia"/>
+          <w:color w:val="404040" w:themeColor="text1" w:themeTint="BF"/>
+          <w:szCs w:val="21"/>
+        </w:rPr>
+        <w:t>、</w:t>
+      </w:r>
+      <w:r>
+        <w:rPr>
+          <w:rFonts w:ascii="Calibri" w:eastAsia="华文细黑" w:hAnsi="Calibri" w:cs="Calibri" w:hint="eastAsia"/>
+          <w:color w:val="404040" w:themeColor="text1" w:themeTint="BF"/>
+          <w:szCs w:val="21"/>
+        </w:rPr>
+        <w:t>nacos</w:t>
+      </w:r>
+      <w:r>
+        <w:rPr>
+          <w:rFonts w:ascii="Calibri" w:eastAsia="华文细黑" w:hAnsi="Calibri" w:cs="Calibri" w:hint="eastAsia"/>
+          <w:color w:val="404040" w:themeColor="text1" w:themeTint="BF"/>
+          <w:szCs w:val="21"/>
+        </w:rPr>
+        <w:t>、</w:t>
+      </w:r>
+      <w:r>
+        <w:rPr>
+          <w:rFonts w:ascii="Calibri" w:eastAsia="华文细黑" w:hAnsi="Calibri" w:cs="Calibri" w:hint="eastAsia"/>
+          <w:color w:val="404040" w:themeColor="text1" w:themeTint="BF"/>
+          <w:szCs w:val="21"/>
+        </w:rPr>
+        <w:t>apollo</w:t>
+      </w:r>
+      <w:r>
+        <w:rPr>
+          <w:rFonts w:ascii="Calibri" w:eastAsia="华文细黑" w:hAnsi="Calibri" w:cs="Calibri" w:hint="eastAsia"/>
+          <w:color w:val="404040" w:themeColor="text1" w:themeTint="BF"/>
+          <w:szCs w:val="21"/>
+        </w:rPr>
+        <w:t>、</w:t>
+      </w:r>
+      <w:r>
+        <w:rPr>
+          <w:rFonts w:ascii="Calibri" w:eastAsia="华文细黑" w:hAnsi="Calibri" w:cs="Calibri" w:hint="eastAsia"/>
+          <w:color w:val="404040" w:themeColor="text1" w:themeTint="BF"/>
+          <w:szCs w:val="21"/>
+        </w:rPr>
+        <w:t>mysql</w:t>
+      </w:r>
+      <w:r>
+        <w:rPr>
+          <w:rFonts w:ascii="Calibri" w:eastAsia="华文细黑" w:hAnsi="Calibri" w:cs="Calibri" w:hint="eastAsia"/>
+          <w:color w:val="404040" w:themeColor="text1" w:themeTint="BF"/>
+          <w:szCs w:val="21"/>
+        </w:rPr>
+        <w:t>、</w:t>
+      </w:r>
+      <w:r>
+        <w:rPr>
+          <w:rFonts w:ascii="Calibri" w:eastAsia="华文细黑" w:hAnsi="Calibri" w:cs="Calibri" w:hint="eastAsia"/>
+          <w:color w:val="404040" w:themeColor="text1" w:themeTint="BF"/>
+          <w:szCs w:val="21"/>
+        </w:rPr>
+        <w:t>elasticsearch</w:t>
+      </w:r>
+      <w:r>
+        <w:rPr>
+          <w:rFonts w:ascii="Calibri" w:eastAsia="华文细黑" w:hAnsi="Calibri" w:cs="Calibri" w:hint="eastAsia"/>
+          <w:color w:val="404040" w:themeColor="text1" w:themeTint="BF"/>
+          <w:szCs w:val="21"/>
+        </w:rPr>
+        <w:t>、</w:t>
+      </w:r>
+      <w:r>
+        <w:rPr>
+          <w:rFonts w:ascii="Calibri" w:eastAsia="华文细黑" w:hAnsi="Calibri" w:cs="Calibri" w:hint="eastAsia"/>
+          <w:color w:val="404040" w:themeColor="text1" w:themeTint="BF"/>
+          <w:szCs w:val="21"/>
+        </w:rPr>
+        <w:t>redis</w:t>
+      </w:r>
+      <w:r>
+        <w:rPr>
+          <w:rFonts w:ascii="Calibri" w:eastAsia="华文细黑" w:hAnsi="Calibri" w:cs="Calibri" w:hint="eastAsia"/>
+          <w:color w:val="404040" w:themeColor="text1" w:themeTint="BF"/>
+          <w:szCs w:val="21"/>
+        </w:rPr>
+        <w:t>、</w:t>
+      </w:r>
+      <w:r>
+        <w:rPr>
+          <w:rFonts w:ascii="Calibri" w:eastAsia="华文细黑" w:hAnsi="Calibri" w:cs="Calibri" w:hint="eastAsia"/>
+          <w:color w:val="404040" w:themeColor="text1" w:themeTint="BF"/>
+          <w:szCs w:val="21"/>
+        </w:rPr>
+        <w:t>kafka</w:t>
+      </w:r>
+      <w:r>
+        <w:rPr>
+          <w:rFonts w:ascii="Calibri" w:eastAsia="华文细黑" w:hAnsi="Calibri" w:cs="Calibri" w:hint="eastAsia"/>
+          <w:color w:val="404040" w:themeColor="text1" w:themeTint="BF"/>
+          <w:szCs w:val="21"/>
+        </w:rPr>
+        <w:t>、</w:t>
+      </w:r>
+      <w:r>
+        <w:rPr>
+          <w:rFonts w:ascii="Calibri" w:eastAsia="华文细黑" w:hAnsi="Calibri" w:cs="Calibri" w:hint="eastAsia"/>
+          <w:color w:val="404040" w:themeColor="text1" w:themeTint="BF"/>
+          <w:szCs w:val="21"/>
+        </w:rPr>
+        <w:t>dws</w:t>
+      </w:r>
+      <w:r>
+        <w:rPr>
+          <w:rFonts w:ascii="Calibri" w:eastAsia="华文细黑" w:hAnsi="Calibri" w:cs="Calibri" w:hint="eastAsia"/>
+          <w:color w:val="404040" w:themeColor="text1" w:themeTint="BF"/>
+          <w:szCs w:val="21"/>
+        </w:rPr>
+        <w:t>、</w:t>
+      </w:r>
+      <w:r>
+        <w:rPr>
+          <w:rFonts w:ascii="Calibri" w:eastAsia="华文细黑" w:hAnsi="Calibri" w:cs="Calibri" w:hint="eastAsia"/>
+          <w:color w:val="404040" w:themeColor="text1" w:themeTint="BF"/>
+          <w:szCs w:val="21"/>
+        </w:rPr>
+        <w:t>EDI</w:t>
+      </w:r>
+    </w:p>
+    <w:p>
+      <w:pPr>
         <w:spacing w:line="400" w:lineRule="exact"/>
+        <w:rPr>
+          <w:rFonts w:ascii="Calibri" w:eastAsia="华文细黑" w:hAnsi="Calibri" w:cs="Calibri"/>
+          <w:b/>
+          <w:bCs/>
+          <w:color w:val="404040" w:themeColor="text1" w:themeTint="BF"/>
+          <w:szCs w:val="21"/>
+        </w:rPr>
+      </w:pPr>
+      <w:r>
+        <w:rPr>
+          <w:rFonts w:ascii="Calibri" w:eastAsia="华文细黑" w:hAnsi="Calibri" w:cs="Calibri" w:hint="eastAsia"/>
+          <w:b/>
+          <w:bCs/>
+          <w:color w:val="404040" w:themeColor="text1" w:themeTint="BF"/>
+          <w:szCs w:val="21"/>
+        </w:rPr>
+        <w:t>工作职责</w:t>
+      </w:r>
+      <w:r>
+        <w:rPr>
+          <w:rFonts w:ascii="Calibri" w:eastAsia="华文细黑" w:hAnsi="Calibri" w:cs="Calibri" w:hint="eastAsia"/>
+          <w:b/>
+          <w:bCs/>
+          <w:color w:val="404040" w:themeColor="text1" w:themeTint="BF"/>
+          <w:szCs w:val="21"/>
+        </w:rPr>
+        <w:t>：</w:t>
+      </w:r>
+    </w:p>
+    <w:p>
+      <w:pPr>
+        <w:pStyle w:val="a3"/>
+        <w:numPr>
+          <w:ilvl w:val="0"/>
+          <w:numId w:val="31"/>
+        </w:numPr>
+        <w:spacing w:line="320" w:lineRule="exact"/>
+        <w:ind w:firstLineChars="0"/>
+        <w:rPr>
+          <w:rFonts w:ascii="Calibri" w:eastAsia="华文细黑" w:hAnsi="Calibri" w:cs="Calibri"/>
+          <w:b/>
+          <w:bCs/>
+          <w:color w:val="404040" w:themeColor="text1" w:themeTint="BF"/>
+          <w:szCs w:val="21"/>
+        </w:rPr>
+      </w:pPr>
+      <w:r>
+        <w:rPr>
+          <w:rFonts w:ascii="Calibri" w:eastAsia="华文细黑" w:hAnsi="Calibri" w:cs="Calibri" w:hint="eastAsia"/>
+          <w:color w:val="404040" w:themeColor="text1" w:themeTint="BF"/>
+          <w:szCs w:val="21"/>
+        </w:rPr>
+        <w:t>负责</w:t>
+      </w:r>
+      <w:r>
+        <w:rPr>
+          <w:rFonts w:ascii="Calibri" w:eastAsia="华文细黑" w:hAnsi="Calibri" w:cs="Calibri" w:hint="eastAsia"/>
+          <w:color w:val="404040" w:themeColor="text1" w:themeTint="BF"/>
+          <w:szCs w:val="21"/>
+        </w:rPr>
+        <w:t>交易</w:t>
+      </w:r>
+      <w:r>
+        <w:rPr>
+          <w:rFonts w:ascii="Calibri" w:eastAsia="华文细黑" w:hAnsi="Calibri" w:cs="Calibri" w:hint="eastAsia"/>
+          <w:color w:val="404040" w:themeColor="text1" w:themeTint="BF"/>
+          <w:szCs w:val="21"/>
+        </w:rPr>
+        <w:t>风控引擎</w:t>
+      </w:r>
+      <w:r>
+        <w:rPr>
+          <w:rFonts w:ascii="Calibri" w:eastAsia="华文细黑" w:hAnsi="Calibri" w:cs="Calibri" w:hint="eastAsia"/>
+          <w:color w:val="404040" w:themeColor="text1" w:themeTint="BF"/>
+          <w:szCs w:val="21"/>
+        </w:rPr>
+        <w:t>应用</w:t>
+      </w:r>
+      <w:r>
+        <w:rPr>
+          <w:rFonts w:ascii="Calibri" w:eastAsia="华文细黑" w:hAnsi="Calibri" w:cs="Calibri" w:hint="eastAsia"/>
+          <w:color w:val="404040" w:themeColor="text1" w:themeTint="BF"/>
+          <w:szCs w:val="21"/>
+        </w:rPr>
+        <w:t>的</w:t>
+      </w:r>
+      <w:r>
+        <w:rPr>
+          <w:rFonts w:ascii="Calibri" w:eastAsia="华文细黑" w:hAnsi="Calibri" w:cs="Calibri" w:hint="eastAsia"/>
+          <w:color w:val="404040" w:themeColor="text1" w:themeTint="BF"/>
+          <w:szCs w:val="21"/>
+        </w:rPr>
+        <w:t>方案</w:t>
+      </w:r>
+      <w:r>
+        <w:rPr>
+          <w:rFonts w:ascii="Calibri" w:eastAsia="华文细黑" w:hAnsi="Calibri" w:cs="Calibri" w:hint="eastAsia"/>
+          <w:color w:val="404040" w:themeColor="text1" w:themeTint="BF"/>
+          <w:szCs w:val="21"/>
+        </w:rPr>
+        <w:t>设计</w:t>
+      </w:r>
+      <w:r>
+        <w:rPr>
+          <w:rFonts w:ascii="Calibri" w:eastAsia="华文细黑" w:hAnsi="Calibri" w:cs="Calibri" w:hint="eastAsia"/>
+          <w:color w:val="404040" w:themeColor="text1" w:themeTint="BF"/>
+          <w:szCs w:val="21"/>
+        </w:rPr>
+        <w:t>，</w:t>
+      </w:r>
+      <w:r>
+        <w:rPr>
+          <w:rFonts w:ascii="Calibri" w:eastAsia="华文细黑" w:hAnsi="Calibri" w:cs="Calibri" w:hint="eastAsia"/>
+          <w:color w:val="404040" w:themeColor="text1" w:themeTint="BF"/>
+          <w:szCs w:val="21"/>
+        </w:rPr>
+        <w:t>基于</w:t>
+      </w:r>
+      <w:r>
+        <w:rPr>
+          <w:rFonts w:ascii="Calibri" w:eastAsia="华文细黑" w:hAnsi="Calibri" w:cs="Calibri" w:hint="eastAsia"/>
+          <w:color w:val="404040" w:themeColor="text1" w:themeTint="BF"/>
+          <w:szCs w:val="21"/>
+        </w:rPr>
+        <w:t>springboot</w:t>
+      </w:r>
+      <w:r>
+        <w:rPr>
+          <w:rFonts w:ascii="Calibri" w:eastAsia="华文细黑" w:hAnsi="Calibri" w:cs="Calibri" w:hint="eastAsia"/>
+          <w:color w:val="404040" w:themeColor="text1" w:themeTint="BF"/>
+          <w:szCs w:val="21"/>
+        </w:rPr>
+        <w:t>、</w:t>
+      </w:r>
+      <w:r>
+        <w:rPr>
+          <w:rFonts w:ascii="Calibri" w:eastAsia="华文细黑" w:hAnsi="Calibri" w:cs="Calibri" w:hint="eastAsia"/>
+          <w:color w:val="404040" w:themeColor="text1" w:themeTint="BF"/>
+          <w:szCs w:val="21"/>
+        </w:rPr>
+        <w:t>dubbo</w:t>
+      </w:r>
+      <w:r>
+        <w:rPr>
+          <w:rFonts w:ascii="Calibri" w:eastAsia="华文细黑" w:hAnsi="Calibri" w:cs="Calibri" w:hint="eastAsia"/>
+          <w:color w:val="404040" w:themeColor="text1" w:themeTint="BF"/>
+          <w:szCs w:val="21"/>
+        </w:rPr>
+        <w:t>体系</w:t>
+      </w:r>
+      <w:r>
+        <w:rPr>
+          <w:rFonts w:ascii="Calibri" w:eastAsia="华文细黑" w:hAnsi="Calibri" w:cs="Calibri" w:hint="eastAsia"/>
+          <w:color w:val="404040" w:themeColor="text1" w:themeTint="BF"/>
+          <w:szCs w:val="21"/>
+        </w:rPr>
+        <w:t>完成</w:t>
+      </w:r>
+      <w:r>
+        <w:rPr>
+          <w:rFonts w:ascii="Calibri" w:eastAsia="华文细黑" w:hAnsi="Calibri" w:cs="Calibri" w:hint="eastAsia"/>
+          <w:color w:val="404040" w:themeColor="text1" w:themeTint="BF"/>
+          <w:szCs w:val="21"/>
+        </w:rPr>
+        <w:t>引擎配置管理、引擎执行核心、执行数据处理的服务拆分、概要设计和</w:t>
+      </w:r>
+      <w:r>
+        <w:rPr>
+          <w:rFonts w:ascii="Calibri" w:eastAsia="华文细黑" w:hAnsi="Calibri" w:cs="Calibri" w:hint="eastAsia"/>
+          <w:color w:val="404040" w:themeColor="text1" w:themeTint="BF"/>
+          <w:szCs w:val="21"/>
+        </w:rPr>
+        <w:t>DFX</w:t>
+      </w:r>
+      <w:r>
+        <w:rPr>
+          <w:rFonts w:ascii="Calibri" w:eastAsia="华文细黑" w:hAnsi="Calibri" w:cs="Calibri" w:hint="eastAsia"/>
+          <w:color w:val="404040" w:themeColor="text1" w:themeTint="BF"/>
+          <w:szCs w:val="21"/>
+        </w:rPr>
+        <w:t>相关设计</w:t>
+      </w:r>
+      <w:r>
+        <w:rPr>
+          <w:rFonts w:ascii="Calibri" w:eastAsia="华文细黑" w:hAnsi="Calibri" w:cs="Calibri" w:hint="eastAsia"/>
+          <w:color w:val="404040" w:themeColor="text1" w:themeTint="BF"/>
+          <w:szCs w:val="21"/>
+        </w:rPr>
+        <w:t>，</w:t>
+      </w:r>
+      <w:r>
+        <w:rPr>
+          <w:rFonts w:ascii="Calibri" w:eastAsia="华文细黑" w:hAnsi="Calibri" w:cs="Calibri" w:hint="eastAsia"/>
+          <w:color w:val="404040" w:themeColor="text1" w:themeTint="BF"/>
+          <w:szCs w:val="21"/>
+        </w:rPr>
+        <w:t>完成引擎服务</w:t>
+      </w:r>
+      <w:r>
+        <w:rPr>
+          <w:rFonts w:ascii="Calibri" w:eastAsia="华文细黑" w:hAnsi="Calibri" w:cs="Calibri" w:hint="eastAsia"/>
+          <w:color w:val="404040" w:themeColor="text1" w:themeTint="BF"/>
+          <w:szCs w:val="21"/>
+        </w:rPr>
+        <w:t>核心代码</w:t>
+      </w:r>
+      <w:r>
+        <w:rPr>
+          <w:rFonts w:ascii="Calibri" w:eastAsia="华文细黑" w:hAnsi="Calibri" w:cs="Calibri" w:hint="eastAsia"/>
+          <w:color w:val="404040" w:themeColor="text1" w:themeTint="BF"/>
+          <w:szCs w:val="21"/>
+        </w:rPr>
+        <w:t>（如策略、规则、规则加载和执行、引擎元素、引擎参数、</w:t>
+      </w:r>
+      <w:r>
+        <w:rPr>
+          <w:rFonts w:ascii="Calibri" w:eastAsia="华文细黑" w:hAnsi="Calibri" w:cs="Calibri" w:hint="eastAsia"/>
+          <w:color w:val="404040" w:themeColor="text1" w:themeTint="BF"/>
+          <w:szCs w:val="21"/>
+        </w:rPr>
+        <w:t>核心</w:t>
+      </w:r>
+      <w:r>
+        <w:rPr>
+          <w:rFonts w:ascii="Calibri" w:eastAsia="华文细黑" w:hAnsi="Calibri" w:cs="Calibri" w:hint="eastAsia"/>
+          <w:color w:val="404040" w:themeColor="text1" w:themeTint="BF"/>
+          <w:szCs w:val="21"/>
+        </w:rPr>
+        <w:t>计算</w:t>
+      </w:r>
+      <w:r>
+        <w:rPr>
+          <w:rFonts w:ascii="Calibri" w:eastAsia="华文细黑" w:hAnsi="Calibri" w:cs="Calibri" w:hint="eastAsia"/>
+          <w:color w:val="404040" w:themeColor="text1" w:themeTint="BF"/>
+          <w:szCs w:val="21"/>
+        </w:rPr>
+        <w:t>算子</w:t>
+      </w:r>
+      <w:r>
+        <w:rPr>
+          <w:rFonts w:ascii="Calibri" w:eastAsia="华文细黑" w:hAnsi="Calibri" w:cs="Calibri" w:hint="eastAsia"/>
+          <w:color w:val="404040" w:themeColor="text1" w:themeTint="BF"/>
+          <w:szCs w:val="21"/>
+        </w:rPr>
+        <w:t>等）</w:t>
+      </w:r>
+      <w:r>
+        <w:rPr>
+          <w:rFonts w:ascii="Calibri" w:eastAsia="华文细黑" w:hAnsi="Calibri" w:cs="Calibri" w:hint="eastAsia"/>
+          <w:color w:val="404040" w:themeColor="text1" w:themeTint="BF"/>
+          <w:szCs w:val="21"/>
+        </w:rPr>
+        <w:t>开发</w:t>
+      </w:r>
+      <w:r>
+        <w:rPr>
+          <w:rFonts w:ascii="Calibri" w:eastAsia="华文细黑" w:hAnsi="Calibri" w:cs="Calibri" w:hint="eastAsia"/>
+          <w:color w:val="404040" w:themeColor="text1" w:themeTint="BF"/>
+          <w:szCs w:val="21"/>
+        </w:rPr>
+        <w:t>，</w:t>
+      </w:r>
+      <w:r>
+        <w:rPr>
+          <w:rFonts w:ascii="Calibri" w:eastAsia="华文细黑" w:hAnsi="Calibri" w:cs="Calibri" w:hint="eastAsia"/>
+          <w:color w:val="404040" w:themeColor="text1" w:themeTint="BF"/>
+          <w:szCs w:val="21"/>
+        </w:rPr>
+        <w:t>支撑运营人员灵活配置风控策略，适配不同业务场景需求</w:t>
+      </w:r>
+    </w:p>
+    <w:p>
+      <w:pPr>
+        <w:pStyle w:val="a3"/>
+        <w:numPr>
+          <w:ilvl w:val="0"/>
+          <w:numId w:val="31"/>
+        </w:numPr>
+        <w:spacing w:line="320" w:lineRule="exact"/>
+        <w:ind w:firstLineChars="0"/>
+        <w:rPr>
+          <w:rFonts w:ascii="Calibri" w:eastAsia="华文细黑" w:hAnsi="Calibri" w:cs="Calibri"/>
+          <w:color w:val="404040" w:themeColor="text1" w:themeTint="BF"/>
+          <w:szCs w:val="21"/>
+        </w:rPr>
+      </w:pPr>
+      <w:r>
+        <w:rPr>
+          <w:rFonts w:ascii="Calibri" w:eastAsia="华文细黑" w:hAnsi="Calibri" w:cs="Calibri" w:hint="eastAsia"/>
+          <w:color w:val="404040" w:themeColor="text1" w:themeTint="BF"/>
+          <w:szCs w:val="21"/>
+        </w:rPr>
+        <w:t>负责</w:t>
+      </w:r>
+      <w:r>
+        <w:rPr>
+          <w:rFonts w:ascii="Calibri" w:eastAsia="华文细黑" w:hAnsi="Calibri" w:cs="Calibri" w:hint="eastAsia"/>
+          <w:color w:val="404040" w:themeColor="text1" w:themeTint="BF"/>
+          <w:szCs w:val="21"/>
+        </w:rPr>
+        <w:t>人机识别</w:t>
+      </w:r>
+      <w:r>
+        <w:rPr>
+          <w:rFonts w:ascii="Calibri" w:eastAsia="华文细黑" w:hAnsi="Calibri" w:cs="Calibri" w:hint="eastAsia"/>
+          <w:color w:val="404040" w:themeColor="text1" w:themeTint="BF"/>
+          <w:szCs w:val="21"/>
+        </w:rPr>
+        <w:t>服务的方案设计，包含设备指纹采集参数</w:t>
+      </w:r>
+      <w:r>
+        <w:rPr>
+          <w:rFonts w:ascii="Calibri" w:eastAsia="华文细黑" w:hAnsi="Calibri" w:cs="Calibri" w:hint="eastAsia"/>
+          <w:color w:val="404040" w:themeColor="text1" w:themeTint="BF"/>
+          <w:szCs w:val="21"/>
+        </w:rPr>
+        <w:t>、</w:t>
+      </w:r>
+      <w:r>
+        <w:rPr>
+          <w:rFonts w:ascii="Calibri" w:eastAsia="华文细黑" w:hAnsi="Calibri" w:cs="Calibri" w:hint="eastAsia"/>
+          <w:color w:val="404040" w:themeColor="text1" w:themeTint="BF"/>
+          <w:szCs w:val="21"/>
+        </w:rPr>
+        <w:t>生成策略</w:t>
+      </w:r>
+      <w:r>
+        <w:rPr>
+          <w:rFonts w:ascii="Calibri" w:eastAsia="华文细黑" w:hAnsi="Calibri" w:cs="Calibri" w:hint="eastAsia"/>
+          <w:color w:val="404040" w:themeColor="text1" w:themeTint="BF"/>
+          <w:szCs w:val="21"/>
+        </w:rPr>
+        <w:t>、以及人机规则执行流程</w:t>
+      </w:r>
+      <w:r>
+        <w:rPr>
+          <w:rFonts w:ascii="Calibri" w:eastAsia="华文细黑" w:hAnsi="Calibri" w:cs="Calibri" w:hint="eastAsia"/>
+          <w:color w:val="404040" w:themeColor="text1" w:themeTint="BF"/>
+          <w:szCs w:val="21"/>
+        </w:rPr>
+        <w:t>等以及</w:t>
+      </w:r>
+      <w:r>
+        <w:rPr>
+          <w:rFonts w:ascii="Calibri" w:eastAsia="华文细黑" w:hAnsi="Calibri" w:cs="Calibri" w:hint="eastAsia"/>
+          <w:color w:val="404040" w:themeColor="text1" w:themeTint="BF"/>
+          <w:szCs w:val="21"/>
+        </w:rPr>
+        <w:t>DFX</w:t>
+      </w:r>
+      <w:r>
+        <w:rPr>
+          <w:rFonts w:ascii="Calibri" w:eastAsia="华文细黑" w:hAnsi="Calibri" w:cs="Calibri" w:hint="eastAsia"/>
+          <w:color w:val="404040" w:themeColor="text1" w:themeTint="BF"/>
+          <w:szCs w:val="21"/>
+        </w:rPr>
+        <w:t>设计</w:t>
+      </w:r>
+      <w:r>
+        <w:rPr>
+          <w:rFonts w:ascii="Calibri" w:eastAsia="华文细黑" w:hAnsi="Calibri" w:cs="Calibri" w:hint="eastAsia"/>
+          <w:color w:val="404040" w:themeColor="text1" w:themeTint="BF"/>
+          <w:szCs w:val="21"/>
+        </w:rPr>
+        <w:t>，</w:t>
+      </w:r>
+      <w:r>
+        <w:rPr>
+          <w:rFonts w:ascii="Calibri" w:eastAsia="华文细黑" w:hAnsi="Calibri" w:cs="Calibri" w:hint="eastAsia"/>
+          <w:color w:val="404040" w:themeColor="text1" w:themeTint="BF"/>
+          <w:szCs w:val="21"/>
+        </w:rPr>
+        <w:t>完成</w:t>
+      </w:r>
+      <w:r>
+        <w:rPr>
+          <w:rFonts w:ascii="Calibri" w:eastAsia="华文细黑" w:hAnsi="Calibri" w:cs="Calibri" w:hint="eastAsia"/>
+          <w:color w:val="404040" w:themeColor="text1" w:themeTint="BF"/>
+          <w:szCs w:val="21"/>
+        </w:rPr>
+        <w:t>人机规则实现及规则执行逻辑开发</w:t>
+      </w:r>
+      <w:r>
+        <w:rPr>
+          <w:rFonts w:ascii="Calibri" w:eastAsia="华文细黑" w:hAnsi="Calibri" w:cs="Calibri" w:hint="eastAsia"/>
+          <w:color w:val="404040" w:themeColor="text1" w:themeTint="BF"/>
+          <w:szCs w:val="21"/>
+        </w:rPr>
+        <w:t>，</w:t>
+      </w:r>
+      <w:r>
+        <w:rPr>
+          <w:rFonts w:ascii="Calibri" w:eastAsia="华文细黑" w:hAnsi="Calibri" w:cs="Calibri" w:hint="eastAsia"/>
+          <w:color w:val="404040" w:themeColor="text1" w:themeTint="BF"/>
+          <w:szCs w:val="21"/>
+        </w:rPr>
+        <w:t>为交易风控提供人机请求识别</w:t>
+      </w:r>
+      <w:r>
+        <w:rPr>
+          <w:rFonts w:ascii="Calibri" w:eastAsia="华文细黑" w:hAnsi="Calibri" w:cs="Calibri" w:hint="eastAsia"/>
+          <w:color w:val="404040" w:themeColor="text1" w:themeTint="BF"/>
+          <w:szCs w:val="21"/>
+        </w:rPr>
+        <w:t>和防御</w:t>
+      </w:r>
+      <w:r>
+        <w:rPr>
+          <w:rFonts w:ascii="Calibri" w:eastAsia="华文细黑" w:hAnsi="Calibri" w:cs="Calibri" w:hint="eastAsia"/>
+          <w:color w:val="404040" w:themeColor="text1" w:themeTint="BF"/>
+          <w:szCs w:val="21"/>
+        </w:rPr>
+        <w:t>能力</w:t>
+      </w:r>
+    </w:p>
+    <w:p>
+      <w:pPr>
+        <w:pStyle w:val="a3"/>
+        <w:numPr>
+          <w:ilvl w:val="0"/>
+          <w:numId w:val="31"/>
+        </w:numPr>
+        <w:spacing w:line="320" w:lineRule="exact"/>
+        <w:ind w:firstLineChars="0"/>
+        <w:rPr>
+          <w:rFonts w:ascii="Calibri" w:eastAsia="华文细黑" w:hAnsi="Calibri" w:cs="Calibri"/>
+          <w:color w:val="404040" w:themeColor="text1" w:themeTint="BF"/>
+          <w:szCs w:val="21"/>
+        </w:rPr>
+      </w:pPr>
+      <w:r>
+        <w:rPr>
+          <w:rFonts w:ascii="Calibri" w:eastAsia="华文细黑" w:hAnsi="Calibri" w:cs="Calibri" w:hint="eastAsia"/>
+          <w:color w:val="404040" w:themeColor="text1" w:themeTint="BF"/>
+          <w:szCs w:val="21"/>
+        </w:rPr>
+        <w:t>负责</w:t>
+      </w:r>
+      <w:r>
+        <w:rPr>
+          <w:rFonts w:ascii="Calibri" w:eastAsia="华文细黑" w:hAnsi="Calibri" w:cs="Calibri" w:hint="eastAsia"/>
+          <w:color w:val="404040" w:themeColor="text1" w:themeTint="BF"/>
+          <w:szCs w:val="21"/>
+        </w:rPr>
+        <w:t>交易风控</w:t>
+      </w:r>
+      <w:r>
+        <w:rPr>
+          <w:rFonts w:ascii="Calibri" w:eastAsia="华文细黑" w:hAnsi="Calibri" w:cs="Calibri" w:hint="eastAsia"/>
+          <w:color w:val="404040" w:themeColor="text1" w:themeTint="BF"/>
+          <w:szCs w:val="21"/>
+        </w:rPr>
+        <w:t>业务运营支撑，</w:t>
+      </w:r>
+      <w:r>
+        <w:rPr>
+          <w:rFonts w:ascii="Calibri" w:eastAsia="华文细黑" w:hAnsi="Calibri" w:cs="Calibri" w:hint="eastAsia"/>
+          <w:color w:val="404040" w:themeColor="text1" w:themeTint="BF"/>
+          <w:szCs w:val="21"/>
+        </w:rPr>
+        <w:t>包括业务接入风控、</w:t>
+      </w:r>
+      <w:r>
+        <w:rPr>
+          <w:rFonts w:ascii="Calibri" w:eastAsia="华文细黑" w:hAnsi="Calibri" w:cs="Calibri" w:hint="eastAsia"/>
+          <w:color w:val="404040" w:themeColor="text1" w:themeTint="BF"/>
+          <w:szCs w:val="21"/>
+        </w:rPr>
+        <w:t>运营风控策略调整、</w:t>
+      </w:r>
+      <w:r>
+        <w:rPr>
+          <w:rFonts w:ascii="Calibri" w:eastAsia="华文细黑" w:hAnsi="Calibri" w:cs="Calibri" w:hint="eastAsia"/>
+          <w:color w:val="404040" w:themeColor="text1" w:themeTint="BF"/>
+          <w:szCs w:val="21"/>
+        </w:rPr>
+        <w:t>客服反馈问题排查</w:t>
+      </w:r>
+      <w:r>
+        <w:rPr>
+          <w:rFonts w:ascii="Calibri" w:eastAsia="华文细黑" w:hAnsi="Calibri" w:cs="Calibri" w:hint="eastAsia"/>
+          <w:color w:val="404040" w:themeColor="text1" w:themeTint="BF"/>
+          <w:szCs w:val="21"/>
+        </w:rPr>
+        <w:t>等</w:t>
+      </w:r>
+      <w:r>
+        <w:rPr>
+          <w:rFonts w:ascii="Calibri" w:eastAsia="华文细黑" w:hAnsi="Calibri" w:cs="Calibri" w:hint="eastAsia"/>
+          <w:color w:val="404040" w:themeColor="text1" w:themeTint="BF"/>
+          <w:szCs w:val="21"/>
+        </w:rPr>
+        <w:t>工作</w:t>
+      </w:r>
+      <w:r>
+        <w:rPr>
+          <w:rFonts w:ascii="Calibri" w:eastAsia="华文细黑" w:hAnsi="Calibri" w:cs="Calibri" w:hint="eastAsia"/>
+          <w:color w:val="404040" w:themeColor="text1" w:themeTint="BF"/>
+          <w:szCs w:val="21"/>
+        </w:rPr>
+        <w:t>，及时响应和处理，助力业务目标达成</w:t>
+      </w:r>
+    </w:p>
+    <w:p>
+      <w:pPr>
+        <w:spacing w:line="320" w:lineRule="exact"/>
+        <w:rPr>
+          <w:rFonts w:ascii="Calibri" w:eastAsia="华文细黑" w:hAnsi="Calibri" w:cs="Calibri"/>
+          <w:color w:val="404040" w:themeColor="text1" w:themeTint="BF"/>
+          <w:szCs w:val="21"/>
+        </w:rPr>
+      </w:pPr>
+    </w:p>
+    <w:p>
+      <w:pPr>
+        <w:spacing w:beforeLines="50" w:before="156" w:line="400" w:lineRule="exact"/>
         <w:rPr>
           <w:rFonts w:ascii="Calibri" w:eastAsia="华文细黑" w:hAnsi="Calibri" w:cs="Calibri"/>
           <w:b/>
@@ -3277,138 +5063,14 @@
       </w:pPr>
       <w:r>
         <w:rPr>
-          <w:rFonts w:ascii="Calibri" w:eastAsia="华文细黑" w:hAnsi="Calibri" w:cs="Calibri" w:hint="eastAsia"/>
+          <w:rFonts w:ascii="Calibri" w:eastAsia="华文细黑" w:hAnsi="Calibri" w:cs="Calibri"/>
           <w:b/>
           <w:bCs/>
           <w:color w:val="404040" w:themeColor="text1" w:themeTint="BF"/>
           <w:sz w:val="24"/>
           <w:szCs w:val="24"/>
         </w:rPr>
-        <w:t>项目经历</w:t>
-      </w:r>
-      <w:r>
-        <w:rPr>
-          <w:rFonts w:ascii="Calibri" w:eastAsia="华文细黑" w:hAnsi="Calibri" w:cs="Calibri" w:hint="eastAsia"/>
-          <w:b/>
-          <w:bCs/>
-          <w:color w:val="404040" w:themeColor="text1" w:themeTint="BF"/>
-          <w:sz w:val="24"/>
-          <w:szCs w:val="24"/>
-        </w:rPr>
-        <w:t>：</w:t>
-      </w:r>
-    </w:p>
-    <w:p>
-      <w:pPr>
-        <w:spacing w:line="320" w:lineRule="exact"/>
-        <w:rPr>
-          <w:rFonts w:ascii="Calibri" w:eastAsia="华文细黑" w:hAnsi="Calibri" w:cs="Calibri"/>
-          <w:b/>
-          <w:bCs/>
-          <w:color w:val="404040" w:themeColor="text1" w:themeTint="BF"/>
-          <w:szCs w:val="21"/>
-        </w:rPr>
-      </w:pPr>
-      <w:r>
-        <w:rPr>
-          <w:rFonts w:ascii="Calibri" w:eastAsia="华文细黑" w:hAnsi="Calibri" w:cs="Calibri" w:hint="eastAsia"/>
-          <w:b/>
-          <w:bCs/>
-          <w:color w:val="404040" w:themeColor="text1" w:themeTint="BF"/>
-          <w:szCs w:val="21"/>
-        </w:rPr>
-        <w:t>项目</w:t>
-      </w:r>
-      <w:r>
-        <w:rPr>
-          <w:rFonts w:ascii="Calibri" w:eastAsia="华文细黑" w:hAnsi="Calibri" w:cs="Calibri" w:hint="eastAsia"/>
-          <w:b/>
-          <w:bCs/>
-          <w:color w:val="404040" w:themeColor="text1" w:themeTint="BF"/>
-          <w:szCs w:val="21"/>
-        </w:rPr>
-        <w:t>一：</w:t>
-      </w:r>
-      <w:r>
-        <w:rPr>
-          <w:rFonts w:ascii="Calibri" w:eastAsia="华文细黑" w:hAnsi="Calibri" w:cs="Calibri" w:hint="eastAsia"/>
-          <w:b/>
-          <w:bCs/>
-          <w:color w:val="404040" w:themeColor="text1" w:themeTint="BF"/>
-          <w:szCs w:val="21"/>
-        </w:rPr>
-        <w:t>内容风控中心化建设</w:t>
-      </w:r>
-    </w:p>
-    <w:p>
-      <w:pPr>
-        <w:spacing w:line="320" w:lineRule="exact"/>
-        <w:rPr>
-          <w:rFonts w:ascii="Calibri" w:eastAsia="华文细黑" w:hAnsi="Calibri" w:cs="Calibri" w:hint="eastAsia"/>
-          <w:b/>
-          <w:bCs/>
-          <w:color w:val="404040" w:themeColor="text1" w:themeTint="BF"/>
-          <w:szCs w:val="21"/>
-        </w:rPr>
-      </w:pPr>
-    </w:p>
-    <w:p>
-      <w:pPr>
-        <w:spacing w:line="320" w:lineRule="exact"/>
-        <w:rPr>
-          <w:rFonts w:ascii="Calibri" w:eastAsia="华文细黑" w:hAnsi="Calibri" w:cs="Calibri"/>
-          <w:color w:val="404040" w:themeColor="text1" w:themeTint="BF"/>
-          <w:szCs w:val="21"/>
-        </w:rPr>
-      </w:pPr>
-      <w:r>
-        <w:rPr>
-          <w:rFonts w:ascii="Calibri" w:eastAsia="华文细黑" w:hAnsi="Calibri" w:cs="Calibri" w:hint="eastAsia"/>
-          <w:color w:val="404040" w:themeColor="text1" w:themeTint="BF"/>
-          <w:szCs w:val="21"/>
-        </w:rPr>
-        <w:t>项目</w:t>
-      </w:r>
-      <w:r>
-        <w:rPr>
-          <w:rFonts w:ascii="Calibri" w:eastAsia="华文细黑" w:hAnsi="Calibri" w:cs="Calibri" w:hint="eastAsia"/>
-          <w:color w:val="404040" w:themeColor="text1" w:themeTint="BF"/>
-          <w:szCs w:val="21"/>
-        </w:rPr>
-        <w:t>二：</w:t>
-      </w:r>
-    </w:p>
-    <w:p>
-      <w:pPr>
-        <w:spacing w:line="320" w:lineRule="exact"/>
-        <w:rPr>
-          <w:rFonts w:ascii="Calibri" w:eastAsia="华文细黑" w:hAnsi="Calibri" w:cs="Calibri" w:hint="eastAsia"/>
-          <w:color w:val="404040" w:themeColor="text1" w:themeTint="BF"/>
-          <w:szCs w:val="21"/>
-        </w:rPr>
-      </w:pPr>
-    </w:p>
-    <w:p>
-      <w:pPr>
-        <w:spacing w:beforeLines="50" w:before="156" w:line="400" w:lineRule="exact"/>
-        <w:rPr>
-          <w:rFonts w:ascii="Calibri" w:eastAsia="华文细黑" w:hAnsi="Calibri" w:cs="Calibri"/>
-          <w:b/>
-          <w:bCs/>
-          <w:color w:val="404040" w:themeColor="text1" w:themeTint="BF"/>
-          <w:sz w:val="24"/>
-          <w:szCs w:val="24"/>
-        </w:rPr>
-      </w:pPr>
-      <w:r>
-        <w:rPr>
-          <w:rFonts w:ascii="Calibri" w:eastAsia="华文细黑" w:hAnsi="Calibri" w:cs="Calibri"/>
-          <w:b/>
-          <w:bCs/>
-          <w:color w:val="404040" w:themeColor="text1" w:themeTint="BF"/>
-          <w:sz w:val="24"/>
-          <w:szCs w:val="24"/>
-        </w:rPr>
+        <w:lastRenderedPageBreak/>
         <w:t>58</w:t>
       </w:r>
       <w:r>
@@ -3943,7 +5605,7 @@
         <w:spacing w:line="320" w:lineRule="exact"/>
         <w:ind w:left="357" w:firstLineChars="0" w:hanging="357"/>
         <w:rPr>
-          <w:rFonts w:ascii="Calibri" w:eastAsia="华文细黑" w:hAnsi="Calibri" w:cs="Calibri" w:hint="eastAsia"/>
+          <w:rFonts w:ascii="Calibri" w:eastAsia="华文细黑" w:hAnsi="Calibri" w:cs="Calibri"/>
           <w:color w:val="404040" w:themeColor="text1" w:themeTint="BF"/>
           <w:szCs w:val="21"/>
         </w:rPr>
@@ -4215,31 +5877,7 @@
           <w:color w:val="404040" w:themeColor="text1" w:themeTint="BF"/>
           <w:szCs w:val="21"/>
         </w:rPr>
-        <w:t>同城蓝领用工招聘平台，相比</w:t>
-      </w:r>
-      <w:r>
-        <w:rPr>
-          <w:rFonts w:ascii="Calibri" w:eastAsia="华文细黑" w:hAnsi="Calibri" w:cs="Calibri" w:hint="eastAsia"/>
-          <w:color w:val="404040" w:themeColor="text1" w:themeTint="BF"/>
-          <w:szCs w:val="21"/>
-        </w:rPr>
-        <w:t>5</w:t>
-      </w:r>
-      <w:r>
-        <w:rPr>
-          <w:rFonts w:ascii="Calibri" w:eastAsia="华文细黑" w:hAnsi="Calibri" w:cs="Calibri"/>
-          <w:color w:val="404040" w:themeColor="text1" w:themeTint="BF"/>
-          <w:szCs w:val="21"/>
-        </w:rPr>
-        <w:t>8</w:t>
-      </w:r>
-      <w:r>
-        <w:rPr>
-          <w:rFonts w:ascii="Calibri" w:eastAsia="华文细黑" w:hAnsi="Calibri" w:cs="Calibri" w:hint="eastAsia"/>
-          <w:color w:val="404040" w:themeColor="text1" w:themeTint="BF"/>
-          <w:szCs w:val="21"/>
-        </w:rPr>
-        <w:t>以往只做招聘信息发布平台，靠出售简历和企业职位发布排名盈利，魔聘招聘平台实现企业职位发布、求职者匹配、邀约面试、企业审核入职，打通了整个招聘流程，靠招聘的增值服务盈利。</w:t>
+        <w:t>同城蓝领用工招聘平台，实现企业职位发布、求职者匹配、邀约面试、企业审核入职，打通整个招聘流程，靠招聘的增值服务盈利。</w:t>
       </w:r>
     </w:p>
     <w:p>
@@ -4535,7 +6173,7 @@
         <w:pStyle w:val="a3"/>
         <w:numPr>
           <w:ilvl w:val="0"/>
-          <w:numId w:val="21"/>
+          <w:numId w:val="31"/>
         </w:numPr>
         <w:spacing w:line="320" w:lineRule="exact"/>
         <w:ind w:left="357" w:firstLineChars="0" w:hanging="357"/>
@@ -4569,7 +6207,7 @@
         <w:pStyle w:val="a3"/>
         <w:numPr>
           <w:ilvl w:val="0"/>
-          <w:numId w:val="21"/>
+          <w:numId w:val="31"/>
         </w:numPr>
         <w:spacing w:line="320" w:lineRule="exact"/>
         <w:ind w:left="357" w:firstLineChars="0" w:hanging="357"/>
@@ -4601,7 +6239,7 @@
         <w:pStyle w:val="a3"/>
         <w:numPr>
           <w:ilvl w:val="0"/>
-          <w:numId w:val="21"/>
+          <w:numId w:val="31"/>
         </w:numPr>
         <w:spacing w:line="320" w:lineRule="exact"/>
         <w:ind w:left="357" w:firstLineChars="0" w:hanging="357"/>
@@ -4649,7 +6287,7 @@
           <w:color w:val="404040" w:themeColor="text1" w:themeTint="BF"/>
           <w:szCs w:val="21"/>
         </w:rPr>
-        <w:t>案例</w:t>
+        <w:t>项目</w:t>
       </w:r>
       <w:r>
         <w:rPr>
@@ -5140,18 +6778,17 @@
         <w:spacing w:line="320" w:lineRule="exact"/>
         <w:ind w:left="357" w:firstLineChars="0" w:hanging="357"/>
         <w:rPr>
-          <w:rFonts w:ascii="Calibri" w:eastAsia="华文细黑" w:hAnsi="Calibri" w:cs="Calibri" w:hint="eastAsia"/>
-          <w:color w:val="404040" w:themeColor="text1" w:themeTint="BF"/>
-          <w:szCs w:val="21"/>
-        </w:rPr>
-      </w:pPr>
-      <w:r>
-        <w:rPr>
-          <w:rFonts w:ascii="Calibri" w:eastAsia="华文细黑" w:hAnsi="Calibri" w:cs="Calibri" w:hint="eastAsia"/>
-          <w:color w:val="404040" w:themeColor="text1" w:themeTint="BF"/>
-          <w:szCs w:val="21"/>
-        </w:rPr>
-        <w:lastRenderedPageBreak/>
+          <w:rFonts w:ascii="Calibri" w:eastAsia="华文细黑" w:hAnsi="Calibri" w:cs="Calibri"/>
+          <w:color w:val="404040" w:themeColor="text1" w:themeTint="BF"/>
+          <w:szCs w:val="21"/>
+        </w:rPr>
+      </w:pPr>
+      <w:r>
+        <w:rPr>
+          <w:rFonts w:ascii="Calibri" w:eastAsia="华文细黑" w:hAnsi="Calibri" w:cs="Calibri" w:hint="eastAsia"/>
+          <w:color w:val="404040" w:themeColor="text1" w:themeTint="BF"/>
+          <w:szCs w:val="21"/>
+        </w:rPr>
         <w:t>开发标签服务，从</w:t>
       </w:r>
       <w:r>
@@ -5868,7 +7505,16 @@
           <w:color w:val="404040" w:themeColor="text1" w:themeTint="BF"/>
           <w:szCs w:val="21"/>
         </w:rPr>
-        <w:t>异常时，实现秒级主备切换</w:t>
+        <w:t>异常时，</w:t>
+      </w:r>
+      <w:r>
+        <w:rPr>
+          <w:rFonts w:ascii="Calibri" w:eastAsia="华文细黑" w:hAnsi="Calibri" w:cs="Calibri" w:hint="eastAsia"/>
+          <w:color w:val="404040" w:themeColor="text1" w:themeTint="BF"/>
+          <w:szCs w:val="21"/>
+        </w:rPr>
+        <w:lastRenderedPageBreak/>
+        <w:t>实现秒级主备切换</w:t>
       </w:r>
     </w:p>
     <w:p>
@@ -7063,7 +8709,7 @@
       <w:pPr>
         <w:spacing w:line="320" w:lineRule="exact"/>
         <w:rPr>
-          <w:rFonts w:ascii="Calibri" w:eastAsia="华文细黑" w:hAnsi="Calibri" w:cs="Calibri" w:hint="eastAsia"/>
+          <w:rFonts w:ascii="Calibri" w:eastAsia="华文细黑" w:hAnsi="Calibri" w:cs="Calibri"/>
           <w:color w:val="404040" w:themeColor="text1" w:themeTint="BF"/>
           <w:szCs w:val="21"/>
         </w:rPr>
@@ -7468,7 +9114,6 @@
           <w:sz w:val="24"/>
           <w:szCs w:val="24"/>
         </w:rPr>
-        <w:lastRenderedPageBreak/>
         <w:t>自我评价</w:t>
       </w:r>
     </w:p>
@@ -7656,7 +9301,77 @@
           <w:color w:val="404040" w:themeColor="text1" w:themeTint="BF"/>
           <w:szCs w:val="21"/>
         </w:rPr>
-        <w:t>为人乐观诚恳，对工作认证负责，工作中领导多次对我工作进行表扬，被评为骨干员工</w:t>
+        <w:t>具备良好的系统设计能力与业务理解能力</w:t>
+      </w:r>
+      <w:r>
+        <w:rPr>
+          <w:rFonts w:ascii="Calibri" w:eastAsia="华文细黑" w:hAnsi="Calibri" w:cs="Calibri" w:hint="eastAsia"/>
+          <w:color w:val="404040" w:themeColor="text1" w:themeTint="BF"/>
+          <w:szCs w:val="21"/>
+        </w:rPr>
+        <w:t>,</w:t>
+      </w:r>
+      <w:r>
+        <w:rPr>
+          <w:rFonts w:hint="eastAsia"/>
+        </w:rPr>
+        <w:t xml:space="preserve"> </w:t>
+      </w:r>
+      <w:r>
+        <w:rPr>
+          <w:rFonts w:ascii="Calibri" w:eastAsia="华文细黑" w:hAnsi="Calibri" w:cs="Calibri" w:hint="eastAsia"/>
+          <w:color w:val="404040" w:themeColor="text1" w:themeTint="BF"/>
+          <w:szCs w:val="21"/>
+        </w:rPr>
+        <w:t>结合业务场景进行微服务架构拆分、技术选型、</w:t>
+      </w:r>
+      <w:r>
+        <w:rPr>
+          <w:rFonts w:ascii="Calibri" w:eastAsia="华文细黑" w:hAnsi="Calibri" w:cs="Calibri" w:hint="eastAsia"/>
+          <w:color w:val="404040" w:themeColor="text1" w:themeTint="BF"/>
+          <w:szCs w:val="21"/>
+        </w:rPr>
+        <w:t>DFX</w:t>
+      </w:r>
+      <w:r>
+        <w:rPr>
+          <w:rFonts w:ascii="Calibri" w:eastAsia="华文细黑" w:hAnsi="Calibri" w:cs="Calibri" w:hint="eastAsia"/>
+          <w:color w:val="404040" w:themeColor="text1" w:themeTint="BF"/>
+          <w:szCs w:val="21"/>
+        </w:rPr>
+        <w:t>设计，能独立主导核心项目的架构落地与解决方案设计，具备从</w:t>
+      </w:r>
+      <w:r>
+        <w:rPr>
+          <w:rFonts w:ascii="Calibri" w:eastAsia="华文细黑" w:hAnsi="Calibri" w:cs="Calibri" w:hint="eastAsia"/>
+          <w:color w:val="404040" w:themeColor="text1" w:themeTint="BF"/>
+          <w:szCs w:val="21"/>
+        </w:rPr>
+        <w:t>0</w:t>
+      </w:r>
+      <w:r>
+        <w:rPr>
+          <w:rFonts w:ascii="Calibri" w:eastAsia="华文细黑" w:hAnsi="Calibri" w:cs="Calibri" w:hint="eastAsia"/>
+          <w:color w:val="404040" w:themeColor="text1" w:themeTint="BF"/>
+          <w:szCs w:val="21"/>
+        </w:rPr>
+        <w:t>到</w:t>
+      </w:r>
+      <w:r>
+        <w:rPr>
+          <w:rFonts w:ascii="Calibri" w:eastAsia="华文细黑" w:hAnsi="Calibri" w:cs="Calibri" w:hint="eastAsia"/>
+          <w:color w:val="404040" w:themeColor="text1" w:themeTint="BF"/>
+          <w:szCs w:val="21"/>
+        </w:rPr>
+        <w:t>1</w:t>
+      </w:r>
+      <w:r>
+        <w:rPr>
+          <w:rFonts w:ascii="Calibri" w:eastAsia="华文细黑" w:hAnsi="Calibri" w:cs="Calibri" w:hint="eastAsia"/>
+          <w:color w:val="404040" w:themeColor="text1" w:themeTint="BF"/>
+          <w:szCs w:val="21"/>
+        </w:rPr>
+        <w:t>搭建大型系统的能力</w:t>
       </w:r>
     </w:p>
     <w:p>
@@ -7680,7 +9395,47 @@
           <w:color w:val="404040" w:themeColor="text1" w:themeTint="BF"/>
           <w:szCs w:val="21"/>
         </w:rPr>
-        <w:t>具备良好的沟通协调能力和团队意识，能快速融入团队</w:t>
+        <w:t>具备</w:t>
+      </w:r>
+      <w:r>
+        <w:rPr>
+          <w:rFonts w:ascii="Calibri" w:eastAsia="华文细黑" w:hAnsi="Calibri" w:cs="Calibri" w:hint="eastAsia"/>
+          <w:color w:val="404040" w:themeColor="text1" w:themeTint="BF"/>
+          <w:szCs w:val="21"/>
+        </w:rPr>
+        <w:t>良好</w:t>
+      </w:r>
+      <w:r>
+        <w:rPr>
+          <w:rFonts w:ascii="Calibri" w:eastAsia="华文细黑" w:hAnsi="Calibri" w:cs="Calibri" w:hint="eastAsia"/>
+          <w:color w:val="404040" w:themeColor="text1" w:themeTint="BF"/>
+          <w:szCs w:val="21"/>
+        </w:rPr>
+        <w:t>的业务理解与问题解决能力，</w:t>
+      </w:r>
+      <w:r>
+        <w:rPr>
+          <w:rFonts w:ascii="Calibri" w:eastAsia="华文细黑" w:hAnsi="Calibri" w:cs="Calibri" w:hint="eastAsia"/>
+          <w:color w:val="404040" w:themeColor="text1" w:themeTint="BF"/>
+          <w:szCs w:val="21"/>
+        </w:rPr>
+        <w:t>能</w:t>
+      </w:r>
+      <w:r>
+        <w:rPr>
+          <w:rFonts w:ascii="Calibri" w:eastAsia="华文细黑" w:hAnsi="Calibri" w:cs="Calibri" w:hint="eastAsia"/>
+          <w:color w:val="404040" w:themeColor="text1" w:themeTint="BF"/>
+          <w:szCs w:val="21"/>
+        </w:rPr>
+        <w:t>利用各种工具</w:t>
+      </w:r>
+      <w:r>
+        <w:rPr>
+          <w:rFonts w:ascii="Calibri" w:eastAsia="华文细黑" w:hAnsi="Calibri" w:cs="Calibri" w:hint="eastAsia"/>
+          <w:color w:val="404040" w:themeColor="text1" w:themeTint="BF"/>
+          <w:szCs w:val="21"/>
+        </w:rPr>
+        <w:t>排查线上故障、优化系统性能，推动系统在高可用、高扩展、高性能方面持续演进；</w:t>
       </w:r>
     </w:p>
     <w:p>
@@ -7693,52 +9448,27 @@
         <w:spacing w:line="320" w:lineRule="atLeast"/>
         <w:ind w:left="357" w:firstLineChars="0" w:hanging="357"/>
         <w:rPr>
-          <w:rFonts w:ascii="Calibri" w:eastAsia="华文细黑" w:hAnsi="Calibri" w:cs="Calibri"/>
-          <w:color w:val="404040" w:themeColor="text1" w:themeTint="BF"/>
-          <w:szCs w:val="21"/>
-        </w:rPr>
-      </w:pPr>
-      <w:r>
-        <w:rPr>
-          <w:rFonts w:ascii="Calibri" w:eastAsia="华文细黑" w:hAnsi="Calibri" w:cs="Calibri" w:hint="eastAsia"/>
-          <w:color w:val="404040" w:themeColor="text1" w:themeTint="BF"/>
-          <w:szCs w:val="21"/>
-        </w:rPr>
-        <w:t>善于学习总结，有较好的业务理解能力，并能依据业务和实际场景选择适合的解决方案，</w:t>
-      </w:r>
-    </w:p>
-    <w:p>
-      <w:pPr>
-        <w:pStyle w:val="a3"/>
-        <w:numPr>
-          <w:ilvl w:val="0"/>
-          <w:numId w:val="28"/>
-        </w:numPr>
-        <w:spacing w:line="320" w:lineRule="atLeast"/>
-        <w:ind w:left="357" w:firstLineChars="0" w:hanging="357"/>
-        <w:rPr>
-          <w:rFonts w:ascii="Calibri" w:eastAsia="华文细黑" w:hAnsi="Calibri" w:cs="Calibri"/>
-          <w:color w:val="404040" w:themeColor="text1" w:themeTint="BF"/>
-          <w:szCs w:val="21"/>
-        </w:rPr>
-      </w:pPr>
-      <w:r>
-        <w:rPr>
-          <w:rFonts w:ascii="Calibri" w:eastAsia="华文细黑" w:hAnsi="Calibri" w:cs="Calibri" w:hint="eastAsia"/>
-          <w:color w:val="404040" w:themeColor="text1" w:themeTint="BF"/>
-          <w:szCs w:val="21"/>
-        </w:rPr>
-        <w:t>能对当前业务的需求进行合理评估，并做出改善建议</w:t>
-      </w:r>
-    </w:p>
-    <w:p>
-      <w:pPr>
-        <w:spacing w:line="360" w:lineRule="exact"/>
-        <w:rPr>
-          <w:rFonts w:ascii="Calibri" w:eastAsia="微软雅黑" w:hAnsi="Calibri" w:cs="Calibri"/>
-          <w:color w:val="404040" w:themeColor="text1" w:themeTint="BF"/>
-        </w:rPr>
-      </w:pPr>
+          <w:rFonts w:ascii="Calibri" w:eastAsia="华文细黑" w:hAnsi="Calibri" w:cs="Calibri" w:hint="eastAsia"/>
+          <w:color w:val="404040" w:themeColor="text1" w:themeTint="BF"/>
+          <w:szCs w:val="21"/>
+        </w:rPr>
+      </w:pPr>
+      <w:r>
+        <w:rPr>
+          <w:rFonts w:ascii="Calibri" w:eastAsia="华文细黑" w:hAnsi="Calibri" w:cs="Calibri" w:hint="eastAsia"/>
+          <w:color w:val="404040" w:themeColor="text1" w:themeTint="BF"/>
+          <w:szCs w:val="21"/>
+        </w:rPr>
+        <w:t>具备良好的项目统筹与团队管理能力，能牵头版本交付、质量管控及技术培训</w:t>
+      </w:r>
+      <w:r>
+        <w:rPr>
+          <w:rFonts w:ascii="Calibri" w:eastAsia="华文细黑" w:hAnsi="Calibri" w:cs="Calibri" w:hint="eastAsia"/>
+          <w:color w:val="404040" w:themeColor="text1" w:themeTint="BF"/>
+          <w:szCs w:val="21"/>
+        </w:rPr>
+        <w:t>，推动项目高质量落地</w:t>
+      </w:r>
     </w:p>
     <w:sectPr>
       <w:headerReference w:type="even" r:id="rId8"/>
@@ -10619,6 +12349,96 @@
       </w:pPr>
     </w:lvl>
     <w:lvl w:ilvl="8" w:tplc="0409001B" w:tentative="1">
+      <w:start w:val="1"/>
+      <w:numFmt w:val="lowerRoman"/>
+      <w:lvlText w:val="%9."/>
+      <w:lvlJc w:val="right"/>
+      <w:pPr>
+        <w:ind w:left="3780" w:hanging="420"/>
+      </w:pPr>
+    </w:lvl>
+  </w:abstractNum>
+  <w:abstractNum w:abstractNumId="30" w15:restartNumberingAfterBreak="0">
+    <w:nsid w:val="7E653CAF"/>
+    <w:multiLevelType w:val="hybridMultilevel"/>
+    <w:tmpl w:val="0DE09A92"/>
+    <w:lvl w:ilvl="0" w:tplc="FFFFFFFF">
+      <w:start w:val="1"/>
+      <w:numFmt w:val="decimal"/>
+      <w:lvlText w:val="%1．"/>
+      <w:lvlJc w:val="left"/>
+      <w:pPr>
+        <w:ind w:left="360" w:hanging="360"/>
+      </w:pPr>
+      <w:rPr>
+        <w:rFonts w:hint="default"/>
+        <w:b w:val="0"/>
+      </w:rPr>
+    </w:lvl>
+    <w:lvl w:ilvl="1" w:tplc="FFFFFFFF" w:tentative="1">
+      <w:start w:val="1"/>
+      <w:numFmt w:val="lowerLetter"/>
+      <w:lvlText w:val="%2)"/>
+      <w:lvlJc w:val="left"/>
+      <w:pPr>
+        <w:ind w:left="840" w:hanging="420"/>
+      </w:pPr>
+    </w:lvl>
+    <w:lvl w:ilvl="2" w:tplc="FFFFFFFF" w:tentative="1">
+      <w:start w:val="1"/>
+      <w:numFmt w:val="lowerRoman"/>
+      <w:lvlText w:val="%3."/>
+      <w:lvlJc w:val="right"/>
+      <w:pPr>
+        <w:ind w:left="1260" w:hanging="420"/>
+      </w:pPr>
+    </w:lvl>
+    <w:lvl w:ilvl="3" w:tplc="FFFFFFFF" w:tentative="1">
+      <w:start w:val="1"/>
+      <w:numFmt w:val="decimal"/>
+      <w:lvlText w:val="%4."/>
+      <w:lvlJc w:val="left"/>
+      <w:pPr>
+        <w:ind w:left="1680" w:hanging="420"/>
+      </w:pPr>
+    </w:lvl>
+    <w:lvl w:ilvl="4" w:tplc="FFFFFFFF" w:tentative="1">
+      <w:start w:val="1"/>
+      <w:numFmt w:val="lowerLetter"/>
+      <w:lvlText w:val="%5)"/>
+      <w:lvlJc w:val="left"/>
+      <w:pPr>
+        <w:ind w:left="2100" w:hanging="420"/>
+      </w:pPr>
+    </w:lvl>
+    <w:lvl w:ilvl="5" w:tplc="FFFFFFFF" w:tentative="1">
+      <w:start w:val="1"/>
+      <w:numFmt w:val="lowerRoman"/>
+      <w:lvlText w:val="%6."/>
+      <w:lvlJc w:val="right"/>
+      <w:pPr>
+        <w:ind w:left="2520" w:hanging="420"/>
+      </w:pPr>
+    </w:lvl>
+    <w:lvl w:ilvl="6" w:tplc="FFFFFFFF" w:tentative="1">
+      <w:start w:val="1"/>
+      <w:numFmt w:val="decimal"/>
+      <w:lvlText w:val="%7."/>
+      <w:lvlJc w:val="left"/>
+      <w:pPr>
+        <w:ind w:left="2940" w:hanging="420"/>
+      </w:pPr>
+    </w:lvl>
+    <w:lvl w:ilvl="7" w:tplc="FFFFFFFF" w:tentative="1">
+      <w:start w:val="1"/>
+      <w:numFmt w:val="lowerLetter"/>
+      <w:lvlText w:val="%8)"/>
+      <w:lvlJc w:val="left"/>
+      <w:pPr>
+        <w:ind w:left="3360" w:hanging="420"/>
+      </w:pPr>
+    </w:lvl>
+    <w:lvl w:ilvl="8" w:tplc="FFFFFFFF" w:tentative="1">
       <w:start w:val="1"/>
       <w:numFmt w:val="lowerRoman"/>
       <w:lvlText w:val="%9."/>
@@ -10717,6 +12537,9 @@
   </w:num>
   <w:num w:numId="30" w16cid:durableId="1746684947">
     <w:abstractNumId w:val="7"/>
+  </w:num>
+  <w:num w:numId="31" w16cid:durableId="928276895">
+    <w:abstractNumId w:val="30"/>
   </w:num>
 </w:numbering>
 </file>
@@ -11116,7 +12939,7 @@
   <w:style w:type="paragraph" w:default="1" w:styleId="a">
     <w:name w:val="Normal"/>
     <w:qFormat/>
-    <w:rsid w:val="008E6C1F"/>
+    <w:rsid w:val="00746187"/>
     <w:pPr>
       <w:widowControl w:val="0"/>
       <w:jc w:val="both"/>
@@ -11125,7 +12948,6 @@
   <w:style w:type="character" w:default="1" w:styleId="a0">
     <w:name w:val="Default Paragraph Font"/>
     <w:uiPriority w:val="1"/>
-    <w:semiHidden/>
     <w:unhideWhenUsed/>
   </w:style>
   <w:style w:type="table" w:default="1" w:styleId="a1">

</xml_diff>